<commit_message>
Complete SD1 and update pdf accordingly
</commit_message>
<xml_diff>
--- a/Prac3.docx
+++ b/Prac3.docx
@@ -1511,6 +1511,201 @@
       </w:r>
       <w:r>
         <w:t xml:space="preserve">called by different collaborators, over different observer lists. </w:t>
+      </w:r>
+    </w:p>
+    <w:p>
+      <w:pPr>
+        <w:pStyle w:val="ListParagraph"/>
+      </w:pPr>
+    </w:p>
+    <w:p>
+      <w:pPr>
+        <w:pStyle w:val="ListParagraph"/>
+      </w:pPr>
+    </w:p>
+    <w:p>
+      <w:pPr>
+        <w:pStyle w:val="Heading1"/>
+        <w:rPr>
+          <w:b/>
+          <w:bCs/>
+          <w:u w:val="single"/>
+        </w:rPr>
+      </w:pPr>
+      <w:r>
+        <w:rPr>
+          <w:b/>
+          <w:bCs/>
+          <w:u w:val="single"/>
+        </w:rPr>
+        <w:t>Task 2:</w:t>
+      </w:r>
+    </w:p>
+    <w:p>
+      <w:r>
+        <w:t xml:space="preserve">2.4) </w:t>
+      </w:r>
+      <w:r>
+        <w:t xml:space="preserve">Calling delete </w:t>
+      </w:r>
+      <w:r>
+        <w:t>N</w:t>
+      </w:r>
+      <w:r>
+        <w:t>exusCon invokes EventGroup::~EventGroup(), which iterates its children vector and calls delete on each pointer. Because TournamentHall, ExpoFloor, and CommunityZone are themselves EventGroup-derived objects, deleting them triggers the same destructor recursively on their own children</w:t>
+      </w:r>
+      <w:r>
+        <w:t xml:space="preserve"> (C</w:t>
+      </w:r>
+      <w:r>
+        <w:t>aster</w:t>
+      </w:r>
+      <w:r>
+        <w:t>Booth</w:t>
+      </w:r>
+      <w:r>
+        <w:t>,</w:t>
+      </w:r>
+      <w:r>
+        <w:t xml:space="preserve"> P</w:t>
+      </w:r>
+      <w:r>
+        <w:t xml:space="preserve">ublisherRow, </w:t>
+      </w:r>
+      <w:r>
+        <w:t>I</w:t>
+      </w:r>
+      <w:r>
+        <w:t>ndieAlley, etc.), which continues down to the leaves (TournamentStage, Booth, DemoKiosk, and so on), where ~EventUnit() and each leaf's own destructor run.</w:t>
+      </w:r>
+    </w:p>
+    <w:p>
+      <w:r>
+        <w:t>Every object is deleted exactly once because every EventComponent* in the tree is stored in the children vector of exactly one parent — no object is ever add()ed to two different EventGroups simultaneously in this design. Since ownership is</w:t>
+      </w:r>
+      <w:r>
+        <w:t xml:space="preserve"> </w:t>
+      </w:r>
+      <w:r>
+        <w:t>non-shared, the recursi</w:t>
+      </w:r>
+      <w:r>
+        <w:t xml:space="preserve">on </w:t>
+      </w:r>
+      <w:r>
+        <w:t xml:space="preserve">visits each node exactly once as it </w:t>
+      </w:r>
+      <w:r>
+        <w:t>travels</w:t>
+      </w:r>
+      <w:r>
+        <w:t xml:space="preserve"> the tree depth-first, and there is no path by which the same pointer could be reached and deleted a second time.</w:t>
+      </w:r>
+    </w:p>
+    <w:p>
+      <w:r>
+        <w:t>This is also why Subject's destructor (on TournamentHall, etc.) is safe alongside this: it only clears its observers list, it never calls delete on the pointers it holds — because those same objects</w:t>
+      </w:r>
+      <w:r>
+        <w:t xml:space="preserve"> </w:t>
+      </w:r>
+      <w:r>
+        <w:t xml:space="preserve">are </w:t>
+      </w:r>
+      <w:r>
+        <w:t>also</w:t>
+      </w:r>
+      <w:r>
+        <w:t xml:space="preserve"> Composite-owned children elsewhere in the tree, and deleting them a second time via the observer list would cause a double-free. This is precisely why 1.4(d)'s ownership split (Composite owns, Subject does not) </w:t>
+      </w:r>
+      <w:r>
+        <w:t>is important.</w:t>
+      </w:r>
+    </w:p>
+    <w:p/>
+    <w:p/>
+    <w:p/>
+    <w:p/>
+    <w:p/>
+    <w:p>
+      <w:pPr>
+        <w:pStyle w:val="Heading1"/>
+        <w:rPr>
+          <w:b/>
+          <w:bCs/>
+          <w:u w:val="single"/>
+        </w:rPr>
+      </w:pPr>
+      <w:r>
+        <w:rPr>
+          <w:b/>
+          <w:bCs/>
+          <w:u w:val="single"/>
+        </w:rPr>
+        <w:lastRenderedPageBreak/>
+        <w:t>Task 5:</w:t>
+      </w:r>
+    </w:p>
+    <w:p>
+      <w:r>
+        <w:drawing>
+          <wp:anchor distT="0" distB="0" distL="114300" distR="114300" simplePos="0" relativeHeight="251658240" behindDoc="1" locked="0" layoutInCell="1" allowOverlap="1" wp14:anchorId="068472BA" wp14:editId="3084BB06">
+            <wp:simplePos x="0" y="0"/>
+            <wp:positionH relativeFrom="margin">
+              <wp:align>center</wp:align>
+            </wp:positionH>
+            <wp:positionV relativeFrom="paragraph">
+              <wp:posOffset>204643</wp:posOffset>
+            </wp:positionV>
+            <wp:extent cx="7398581" cy="2144683"/>
+            <wp:effectExtent l="0" t="0" r="0" b="8255"/>
+            <wp:wrapNone/>
+            <wp:docPr id="598388384" name="Picture 1"/>
+            <wp:cNvGraphicFramePr>
+              <a:graphicFrameLocks xmlns:a="http://schemas.openxmlformats.org/drawingml/2006/main" noChangeAspect="1"/>
+            </wp:cNvGraphicFramePr>
+            <a:graphic xmlns:a="http://schemas.openxmlformats.org/drawingml/2006/main">
+              <a:graphicData uri="http://schemas.openxmlformats.org/drawingml/2006/picture">
+                <pic:pic xmlns:pic="http://schemas.openxmlformats.org/drawingml/2006/picture">
+                  <pic:nvPicPr>
+                    <pic:cNvPr id="598388384" name=""/>
+                    <pic:cNvPicPr/>
+                  </pic:nvPicPr>
+                  <pic:blipFill>
+                    <a:blip r:embed="rId5">
+                      <a:extLst>
+                        <a:ext uri="{28A0092B-C50C-407E-A947-70E740481C1C}">
+                          <a14:useLocalDpi xmlns:a14="http://schemas.microsoft.com/office/drawing/2010/main" val="0"/>
+                        </a:ext>
+                      </a:extLst>
+                    </a:blip>
+                    <a:stretch>
+                      <a:fillRect/>
+                    </a:stretch>
+                  </pic:blipFill>
+                  <pic:spPr>
+                    <a:xfrm>
+                      <a:off x="0" y="0"/>
+                      <a:ext cx="7398581" cy="2144683"/>
+                    </a:xfrm>
+                    <a:prstGeom prst="rect">
+                      <a:avLst/>
+                    </a:prstGeom>
+                  </pic:spPr>
+                </pic:pic>
+              </a:graphicData>
+            </a:graphic>
+            <wp14:sizeRelH relativeFrom="page">
+              <wp14:pctWidth>0</wp14:pctWidth>
+            </wp14:sizeRelH>
+            <wp14:sizeRelV relativeFrom="page">
+              <wp14:pctHeight>0</wp14:pctHeight>
+            </wp14:sizeRelV>
+          </wp:anchor>
+        </w:drawing>
+      </w:r>
+      <w:r>
+        <w:t xml:space="preserve">5.1) </w:t>
       </w:r>
     </w:p>
     <w:p/>
@@ -1534,6 +1729,7 @@
     <w:p/>
     <w:p/>
     <w:p/>
+    <w:p/>
     <w:p>
       <w:pPr>
         <w:rPr>
@@ -1552,22 +1748,22 @@
           <w:szCs w:val="32"/>
           <w:u w:val="single"/>
         </w:rPr>
+        <w:t>Layout:</w:t>
+      </w:r>
+    </w:p>
+    <w:p>
+      <w:r>
+        <w:t xml:space="preserve">NexusCon (root) </w:t>
+      </w:r>
+    </w:p>
+    <w:p>
+      <w:r>
+        <w:t xml:space="preserve">| </w:t>
+      </w:r>
+    </w:p>
+    <w:p>
+      <w:r>
         <w:lastRenderedPageBreak/>
-        <w:t>Layout:</w:t>
-      </w:r>
-    </w:p>
-    <w:p>
-      <w:r>
-        <w:t xml:space="preserve">NexusCon (root) </w:t>
-      </w:r>
-    </w:p>
-    <w:p>
-      <w:r>
-        <w:t xml:space="preserve">| </w:t>
-      </w:r>
-    </w:p>
-    <w:p>
-      <w:r>
         <w:t xml:space="preserve">+-- Tournament Hall </w:t>
       </w:r>
     </w:p>
@@ -4050,6 +4246,7 @@
   <w:style w:type="character" w:default="1" w:styleId="DefaultParagraphFont">
     <w:name w:val="Default Paragraph Font"/>
     <w:uiPriority w:val="1"/>
+    <w:semiHidden/>
     <w:unhideWhenUsed/>
   </w:style>
   <w:style w:type="table" w:default="1" w:styleId="TableNormal">
@@ -4360,6 +4557,17 @@
       <w:smallCaps/>
       <w:color w:val="0F4761" w:themeColor="accent1" w:themeShade="BF"/>
       <w:spacing w:val="5"/>
+    </w:rPr>
+  </w:style>
+  <w:style w:type="paragraph" w:styleId="NormalWeb">
+    <w:name w:val="Normal (Web)"/>
+    <w:basedOn w:val="Normal"/>
+    <w:uiPriority w:val="99"/>
+    <w:semiHidden/>
+    <w:unhideWhenUsed/>
+    <w:rsid w:val="0057728C"/>
+    <w:rPr>
+      <w:rFonts w:ascii="Times New Roman" w:hAnsi="Times New Roman" w:cs="Times New Roman"/>
     </w:rPr>
   </w:style>
 </w:styles>

</xml_diff>

<commit_message>
Completed object diagram and updated pdf accordingly
</commit_message>
<xml_diff>
--- a/Prac3.docx
+++ b/Prac3.docx
@@ -1543,6 +1543,49 @@
     </w:p>
     <w:p>
       <w:r>
+        <w:t xml:space="preserve">2.3) </w:t>
+      </w:r>
+      <w:r>
+        <w:drawing>
+          <wp:inline distT="0" distB="0" distL="0" distR="0" wp14:anchorId="2018F182" wp14:editId="77F5C78A">
+            <wp:extent cx="5624482" cy="5549931"/>
+            <wp:effectExtent l="0" t="0" r="0" b="0"/>
+            <wp:docPr id="836304078" name="Picture 1"/>
+            <wp:cNvGraphicFramePr>
+              <a:graphicFrameLocks xmlns:a="http://schemas.openxmlformats.org/drawingml/2006/main" noChangeAspect="1"/>
+            </wp:cNvGraphicFramePr>
+            <a:graphic xmlns:a="http://schemas.openxmlformats.org/drawingml/2006/main">
+              <a:graphicData uri="http://schemas.openxmlformats.org/drawingml/2006/picture">
+                <pic:pic xmlns:pic="http://schemas.openxmlformats.org/drawingml/2006/picture">
+                  <pic:nvPicPr>
+                    <pic:cNvPr id="836304078" name=""/>
+                    <pic:cNvPicPr/>
+                  </pic:nvPicPr>
+                  <pic:blipFill>
+                    <a:blip r:embed="rId5"/>
+                    <a:stretch>
+                      <a:fillRect/>
+                    </a:stretch>
+                  </pic:blipFill>
+                  <pic:spPr>
+                    <a:xfrm>
+                      <a:off x="0" y="0"/>
+                      <a:ext cx="5624482" cy="5549931"/>
+                    </a:xfrm>
+                    <a:prstGeom prst="rect">
+                      <a:avLst/>
+                    </a:prstGeom>
+                  </pic:spPr>
+                </pic:pic>
+              </a:graphicData>
+            </a:graphic>
+          </wp:inline>
+        </w:drawing>
+      </w:r>
+    </w:p>
+    <w:p>
+      <w:r>
+        <w:lastRenderedPageBreak/>
         <w:t xml:space="preserve">2.4) </w:t>
       </w:r>
       <w:r>
@@ -1642,7 +1685,6 @@
           <w:bCs/>
           <w:u w:val="single"/>
         </w:rPr>
-        <w:lastRenderedPageBreak/>
         <w:t>Task 5:</w:t>
       </w:r>
     </w:p>
@@ -1672,7 +1714,7 @@
                     <pic:cNvPicPr/>
                   </pic:nvPicPr>
                   <pic:blipFill>
-                    <a:blip r:embed="rId5">
+                    <a:blip r:embed="rId6">
                       <a:extLst>
                         <a:ext uri="{28A0092B-C50C-407E-A947-70E740481C1C}">
                           <a14:useLocalDpi xmlns:a14="http://schemas.microsoft.com/office/drawing/2010/main" val="0"/>
@@ -1763,131 +1805,131 @@
     </w:p>
     <w:p>
       <w:r>
+        <w:t xml:space="preserve">+-- Tournament Hall </w:t>
+      </w:r>
+    </w:p>
+    <w:p>
+      <w:r>
+        <w:t>|</w:t>
+      </w:r>
+      <w:r>
+        <w:tab/>
+      </w:r>
+      <w:r>
+        <w:t xml:space="preserve">+-- Main Arena </w:t>
+      </w:r>
+    </w:p>
+    <w:p>
+      <w:r>
+        <w:t xml:space="preserve">| </w:t>
+      </w:r>
+      <w:r>
+        <w:tab/>
+      </w:r>
+      <w:r>
+        <w:t xml:space="preserve">| </w:t>
+      </w:r>
+      <w:r>
+        <w:tab/>
+      </w:r>
+      <w:r>
+        <w:t xml:space="preserve">+-- Tournament Stage </w:t>
+      </w:r>
+    </w:p>
+    <w:p>
+      <w:r>
+        <w:t xml:space="preserve">| </w:t>
+      </w:r>
+      <w:r>
+        <w:tab/>
+      </w:r>
+      <w:r>
+        <w:t xml:space="preserve">| </w:t>
+      </w:r>
+      <w:r>
+        <w:tab/>
+      </w:r>
+      <w:r>
+        <w:t xml:space="preserve">+-- Caster Booth </w:t>
+      </w:r>
+    </w:p>
+    <w:p>
+      <w:r>
+        <w:t xml:space="preserve">| </w:t>
+      </w:r>
+      <w:r>
+        <w:tab/>
+      </w:r>
+      <w:r>
+        <w:t xml:space="preserve">| </w:t>
+      </w:r>
+    </w:p>
+    <w:p>
+      <w:r>
+        <w:t xml:space="preserve">| </w:t>
+      </w:r>
+      <w:r>
+        <w:tab/>
+      </w:r>
+      <w:r>
+        <w:t xml:space="preserve">+-- Practice Zone </w:t>
+      </w:r>
+    </w:p>
+    <w:p>
+      <w:r>
+        <w:t xml:space="preserve">| </w:t>
+      </w:r>
+      <w:r>
+        <w:tab/>
+      </w:r>
+      <w:r>
+        <w:tab/>
+      </w:r>
+      <w:r>
+        <w:t xml:space="preserve">+-- Practice Booth </w:t>
+      </w:r>
+    </w:p>
+    <w:p>
+      <w:r>
+        <w:t xml:space="preserve">| </w:t>
+      </w:r>
+    </w:p>
+    <w:p>
+      <w:r>
+        <w:t xml:space="preserve">+-- Expo Floor </w:t>
+      </w:r>
+    </w:p>
+    <w:p>
+      <w:r>
+        <w:t xml:space="preserve">| </w:t>
+      </w:r>
+      <w:r>
+        <w:tab/>
+      </w:r>
+      <w:r>
+        <w:t xml:space="preserve">+-- Publisher Row </w:t>
+      </w:r>
+    </w:p>
+    <w:p>
+      <w:r>
+        <w:t xml:space="preserve">| </w:t>
+      </w:r>
+      <w:r>
+        <w:tab/>
+      </w:r>
+      <w:r>
+        <w:t xml:space="preserve">| </w:t>
+      </w:r>
+      <w:r>
+        <w:tab/>
+      </w:r>
+      <w:r>
+        <w:t xml:space="preserve">+-- Booth </w:t>
+      </w:r>
+    </w:p>
+    <w:p>
+      <w:r>
         <w:lastRenderedPageBreak/>
-        <w:t xml:space="preserve">+-- Tournament Hall </w:t>
-      </w:r>
-    </w:p>
-    <w:p>
-      <w:r>
-        <w:t>|</w:t>
-      </w:r>
-      <w:r>
-        <w:tab/>
-      </w:r>
-      <w:r>
-        <w:t xml:space="preserve">+-- Main Arena </w:t>
-      </w:r>
-    </w:p>
-    <w:p>
-      <w:r>
-        <w:t xml:space="preserve">| </w:t>
-      </w:r>
-      <w:r>
-        <w:tab/>
-      </w:r>
-      <w:r>
-        <w:t xml:space="preserve">| </w:t>
-      </w:r>
-      <w:r>
-        <w:tab/>
-      </w:r>
-      <w:r>
-        <w:t xml:space="preserve">+-- Tournament Stage </w:t>
-      </w:r>
-    </w:p>
-    <w:p>
-      <w:r>
-        <w:t xml:space="preserve">| </w:t>
-      </w:r>
-      <w:r>
-        <w:tab/>
-      </w:r>
-      <w:r>
-        <w:t xml:space="preserve">| </w:t>
-      </w:r>
-      <w:r>
-        <w:tab/>
-      </w:r>
-      <w:r>
-        <w:t xml:space="preserve">+-- Caster Booth </w:t>
-      </w:r>
-    </w:p>
-    <w:p>
-      <w:r>
-        <w:t xml:space="preserve">| </w:t>
-      </w:r>
-      <w:r>
-        <w:tab/>
-      </w:r>
-      <w:r>
-        <w:t xml:space="preserve">| </w:t>
-      </w:r>
-    </w:p>
-    <w:p>
-      <w:r>
-        <w:t xml:space="preserve">| </w:t>
-      </w:r>
-      <w:r>
-        <w:tab/>
-      </w:r>
-      <w:r>
-        <w:t xml:space="preserve">+-- Practice Zone </w:t>
-      </w:r>
-    </w:p>
-    <w:p>
-      <w:r>
-        <w:t xml:space="preserve">| </w:t>
-      </w:r>
-      <w:r>
-        <w:tab/>
-      </w:r>
-      <w:r>
-        <w:tab/>
-      </w:r>
-      <w:r>
-        <w:t xml:space="preserve">+-- Practice Booth </w:t>
-      </w:r>
-    </w:p>
-    <w:p>
-      <w:r>
-        <w:t xml:space="preserve">| </w:t>
-      </w:r>
-    </w:p>
-    <w:p>
-      <w:r>
-        <w:t xml:space="preserve">+-- Expo Floor </w:t>
-      </w:r>
-    </w:p>
-    <w:p>
-      <w:r>
-        <w:t xml:space="preserve">| </w:t>
-      </w:r>
-      <w:r>
-        <w:tab/>
-      </w:r>
-      <w:r>
-        <w:t xml:space="preserve">+-- Publisher Row </w:t>
-      </w:r>
-    </w:p>
-    <w:p>
-      <w:r>
-        <w:t xml:space="preserve">| </w:t>
-      </w:r>
-      <w:r>
-        <w:tab/>
-      </w:r>
-      <w:r>
-        <w:t xml:space="preserve">| </w:t>
-      </w:r>
-      <w:r>
-        <w:tab/>
-      </w:r>
-      <w:r>
-        <w:t xml:space="preserve">+-- Booth </w:t>
-      </w:r>
-    </w:p>
-    <w:p>
-      <w:r>
         <w:t xml:space="preserve">| </w:t>
       </w:r>
       <w:r>

</xml_diff>

<commit_message>
Added task 3, 4, sd2 and sd3
</commit_message>
<xml_diff>
--- a/Prac3.docx
+++ b/Prac3.docx
@@ -1,6 +1,6 @@
 
 <file path=word/document.xml><?xml version="1.0" encoding="utf-8"?>
-<w:document xmlns:wpc="http://schemas.microsoft.com/office/word/2010/wordprocessingCanvas" xmlns:cx="http://schemas.microsoft.com/office/drawing/2014/chartex" xmlns:cx1="http://schemas.microsoft.com/office/drawing/2015/9/8/chartex" xmlns:cx2="http://schemas.microsoft.com/office/drawing/2015/10/21/chartex" xmlns:cx3="http://schemas.microsoft.com/office/drawing/2016/5/9/chartex" xmlns:cx4="http://schemas.microsoft.com/office/drawing/2016/5/10/chartex" xmlns:cx5="http://schemas.microsoft.com/office/drawing/2016/5/11/chartex" xmlns:cx6="http://schemas.microsoft.com/office/drawing/2016/5/12/chartex" xmlns:cx7="http://schemas.microsoft.com/office/drawing/2016/5/13/chartex" xmlns:cx8="http://schemas.microsoft.com/office/drawing/2016/5/14/chartex" xmlns:mc="http://schemas.openxmlformats.org/markup-compatibility/2006" xmlns:aink="http://schemas.microsoft.com/office/drawing/2016/ink" xmlns:am3d="http://schemas.microsoft.com/office/drawing/2017/model3d" xmlns:o="urn:schemas-microsoft-com:office:office" xmlns:oel="http://schemas.microsoft.com/office/2019/extlst" xmlns:r="http://schemas.openxmlformats.org/officeDocument/2006/relationships" xmlns:m="http://schemas.openxmlformats.org/officeDocument/2006/math" xmlns:v="urn:schemas-microsoft-com:vml" xmlns:wp14="http://schemas.microsoft.com/office/word/2010/wordprocessingDrawing" xmlns:wp="http://schemas.openxmlformats.org/drawingml/2006/wordprocessingDrawing" xmlns:w10="urn:schemas-microsoft-com:office:word" xmlns:w="http://schemas.openxmlformats.org/wordprocessingml/2006/main" xmlns:w14="http://schemas.microsoft.com/office/word/2010/wordml" xmlns:w15="http://schemas.microsoft.com/office/word/2012/wordml" xmlns:w16cei="http://schemas.microsoft.com/office/word/2026/wordml/cei" xmlns:w16cex="http://schemas.microsoft.com/office/word/2018/wordml/cex" xmlns:w16cid="http://schemas.microsoft.com/office/word/2016/wordml/cid" xmlns:w16="http://schemas.microsoft.com/office/word/2018/wordml" xmlns:w16du="http://schemas.microsoft.com/office/word/2023/wordml/word16du" xmlns:w16sdtdh="http://schemas.microsoft.com/office/word/2020/wordml/sdtdatahash" xmlns:w16sdtfl="http://schemas.microsoft.com/office/word/2024/wordml/sdtformatlock" xmlns:w16se="http://schemas.microsoft.com/office/word/2015/wordml/symex" xmlns:wpg="http://schemas.microsoft.com/office/word/2010/wordprocessingGroup" xmlns:wpi="http://schemas.microsoft.com/office/word/2010/wordprocessingInk" xmlns:wne="http://schemas.microsoft.com/office/word/2006/wordml" xmlns:wps="http://schemas.microsoft.com/office/word/2010/wordprocessingShape" mc:Ignorable="w14 w15 w16se w16cid w16 w16cex w16sdtdh w16sdtfl w16du wp14">
+<w:document xmlns:wpc="http://schemas.microsoft.com/office/word/2010/wordprocessingCanvas" xmlns:cx="http://schemas.microsoft.com/office/drawing/2014/chartex" xmlns:cx1="http://schemas.microsoft.com/office/drawing/2015/9/8/chartex" xmlns:cx2="http://schemas.microsoft.com/office/drawing/2015/10/21/chartex" xmlns:cx3="http://schemas.microsoft.com/office/drawing/2016/5/9/chartex" xmlns:cx4="http://schemas.microsoft.com/office/drawing/2016/5/10/chartex" xmlns:cx5="http://schemas.microsoft.com/office/drawing/2016/5/11/chartex" xmlns:cx6="http://schemas.microsoft.com/office/drawing/2016/5/12/chartex" xmlns:cx7="http://schemas.microsoft.com/office/drawing/2016/5/13/chartex" xmlns:cx8="http://schemas.microsoft.com/office/drawing/2016/5/14/chartex" xmlns:mc="http://schemas.openxmlformats.org/markup-compatibility/2006" xmlns:aink="http://schemas.microsoft.com/office/drawing/2016/ink" xmlns:am3d="http://schemas.microsoft.com/office/drawing/2017/model3d" xmlns:o="urn:schemas-microsoft-com:office:office" xmlns:oel="http://schemas.microsoft.com/office/2019/extlst" xmlns:r="http://schemas.openxmlformats.org/officeDocument/2006/relationships" xmlns:m="http://schemas.openxmlformats.org/officeDocument/2006/math" xmlns:v="urn:schemas-microsoft-com:vml" xmlns:wp14="http://schemas.microsoft.com/office/word/2010/wordprocessingDrawing" xmlns:wp="http://schemas.openxmlformats.org/drawingml/2006/wordprocessingDrawing" xmlns:w10="urn:schemas-microsoft-com:office:word" xmlns:w="http://schemas.openxmlformats.org/wordprocessingml/2006/main" xmlns:w14="http://schemas.microsoft.com/office/word/2010/wordml" xmlns:w15="http://schemas.microsoft.com/office/word/2012/wordml" xmlns:w16cex="http://schemas.microsoft.com/office/word/2018/wordml/cex" xmlns:w16cid="http://schemas.microsoft.com/office/word/2016/wordml/cid" xmlns:w16="http://schemas.microsoft.com/office/word/2018/wordml" xmlns:w16du="http://schemas.microsoft.com/office/word/2023/wordml/word16du" xmlns:w16sdtdh="http://schemas.microsoft.com/office/word/2020/wordml/sdtdatahash" xmlns:w16sdtfl="http://schemas.microsoft.com/office/word/2024/wordml/sdtformatlock" xmlns:w16se="http://schemas.microsoft.com/office/word/2015/wordml/symex" xmlns:wpg="http://schemas.microsoft.com/office/word/2010/wordprocessingGroup" xmlns:wpi="http://schemas.microsoft.com/office/word/2010/wordprocessingInk" xmlns:wne="http://schemas.microsoft.com/office/word/2006/wordml" xmlns:wps="http://schemas.microsoft.com/office/word/2010/wordprocessingShape" mc:Ignorable="w14 w15 w16se w16cid w16 w16cex w16sdtdh w16sdtfl w16du wp14">
   <w:body>
     <w:p>
       <w:pPr>
@@ -134,71 +134,9 @@
           <w:b/>
           <w:bCs/>
         </w:rPr>
-        <w:t>Event name: NexusCon — a three-day gaming convention</w:t>
-      </w:r>
-    </w:p>
-    <w:p>
-      <w:pPr>
-        <w:pStyle w:val="ListParagraph"/>
-      </w:pPr>
-    </w:p>
-    <w:p>
-      <w:pPr>
-        <w:pStyle w:val="ListParagraph"/>
-      </w:pPr>
-      <w:r>
-        <w:t>NexusCon is a large-scale gaming convention</w:t>
-      </w:r>
-      <w:r>
-        <w:t xml:space="preserve">, which </w:t>
-      </w:r>
-      <w:r>
-        <w:t>includ</w:t>
-      </w:r>
-      <w:r>
-        <w:t>es</w:t>
-      </w:r>
-      <w:r>
-        <w:t xml:space="preserve"> competitive esports tournaments, a publisher/indie expo floor, and community-</w:t>
-      </w:r>
-      <w:r>
-        <w:t>based</w:t>
-      </w:r>
-      <w:r>
-        <w:t xml:space="preserve"> activities. The event runs across multiple halls and outdoor areas, with thousands of attendees moving between zones. Because tournaments run on live schedules, expo booths run demo hardware continuously, and the event must respond to real-time issues (technical </w:t>
-      </w:r>
-      <w:r>
-        <w:t>issues</w:t>
-      </w:r>
-      <w:r>
-        <w:t xml:space="preserve">, capacity overflows, safety alerts), the venue needs both a nested spatial structure (to organise and query areas) and a notification structure (so </w:t>
-      </w:r>
-      <w:r>
-        <w:t>necessary</w:t>
-      </w:r>
-      <w:r>
-        <w:t xml:space="preserve"> changes </w:t>
-      </w:r>
-      <w:r>
-        <w:t>spread</w:t>
-      </w:r>
-      <w:r>
-        <w:t xml:space="preserve"> quickly to only the</w:t>
-      </w:r>
-      <w:r>
-        <w:t>ir</w:t>
-      </w:r>
-      <w:r>
-        <w:t xml:space="preserve"> relevant areas).</w:t>
-      </w:r>
-    </w:p>
-    <w:p>
-      <w:pPr>
-        <w:pStyle w:val="ListParagraph"/>
-      </w:pPr>
-      <w:r>
-        <w:t xml:space="preserve">The event is organised as a tree of nested areas. At the top level, </w:t>
-      </w:r>
+        <w:t xml:space="preserve">Event name: </w:t>
+      </w:r>
+      <w:proofErr w:type="spellStart"/>
       <w:r>
         <w:rPr>
           <w:b/>
@@ -206,6 +144,91 @@
         </w:rPr>
         <w:t>NexusCon</w:t>
       </w:r>
+      <w:proofErr w:type="spellEnd"/>
+      <w:r>
+        <w:rPr>
+          <w:b/>
+          <w:bCs/>
+        </w:rPr>
+        <w:t xml:space="preserve"> — a three-day gaming convention</w:t>
+      </w:r>
+    </w:p>
+    <w:p>
+      <w:pPr>
+        <w:pStyle w:val="ListParagraph"/>
+      </w:pPr>
+    </w:p>
+    <w:p>
+      <w:pPr>
+        <w:pStyle w:val="ListParagraph"/>
+      </w:pPr>
+      <w:proofErr w:type="spellStart"/>
+      <w:r>
+        <w:t>NexusCon</w:t>
+      </w:r>
+      <w:proofErr w:type="spellEnd"/>
+      <w:r>
+        <w:t xml:space="preserve"> is a large-scale gaming convention</w:t>
+      </w:r>
+      <w:r>
+        <w:t xml:space="preserve">, which </w:t>
+      </w:r>
+      <w:r>
+        <w:t>includ</w:t>
+      </w:r>
+      <w:r>
+        <w:t>es</w:t>
+      </w:r>
+      <w:r>
+        <w:t xml:space="preserve"> competitive esports tournaments, a publisher/indie expo floor, and community-</w:t>
+      </w:r>
+      <w:r>
+        <w:t>based</w:t>
+      </w:r>
+      <w:r>
+        <w:t xml:space="preserve"> activities. The event runs across multiple halls and outdoor areas, with thousands of attendees moving between zones. Because tournaments run on live schedules, expo booths run demo hardware continuously, and the event must respond to real-time issues (technical </w:t>
+      </w:r>
+      <w:r>
+        <w:t>issues</w:t>
+      </w:r>
+      <w:r>
+        <w:t xml:space="preserve">, capacity overflows, safety alerts), the venue needs both a nested spatial structure (to organise and query areas) and a notification structure (so </w:t>
+      </w:r>
+      <w:r>
+        <w:t>necessary</w:t>
+      </w:r>
+      <w:r>
+        <w:t xml:space="preserve"> changes </w:t>
+      </w:r>
+      <w:r>
+        <w:t>spread</w:t>
+      </w:r>
+      <w:r>
+        <w:t xml:space="preserve"> quickly to only the</w:t>
+      </w:r>
+      <w:r>
+        <w:t>ir</w:t>
+      </w:r>
+      <w:r>
+        <w:t xml:space="preserve"> relevant areas).</w:t>
+      </w:r>
+    </w:p>
+    <w:p>
+      <w:pPr>
+        <w:pStyle w:val="ListParagraph"/>
+      </w:pPr>
+      <w:r>
+        <w:t xml:space="preserve">The event is organised as a tree of nested areas. At the top level, </w:t>
+      </w:r>
+      <w:proofErr w:type="spellStart"/>
+      <w:r>
+        <w:rPr>
+          <w:b/>
+          <w:bCs/>
+        </w:rPr>
+        <w:t>NexusCon</w:t>
+      </w:r>
+      <w:proofErr w:type="spellEnd"/>
       <w:r>
         <w:t xml:space="preserve"> contains three major zones: the </w:t>
       </w:r>
@@ -523,7 +546,15 @@
         <w:t>First Aid Point:</w:t>
       </w:r>
       <w:r>
-        <w:t xml:space="preserve"> Remains open at all times for potential medical emergencies</w:t>
+        <w:t xml:space="preserve"> Remains </w:t>
+      </w:r>
+      <w:proofErr w:type="gramStart"/>
+      <w:r>
+        <w:t>open at all times</w:t>
+      </w:r>
+      <w:proofErr w:type="gramEnd"/>
+      <w:r>
+        <w:t xml:space="preserve"> for potential medical emergencies</w:t>
       </w:r>
       <w:r>
         <w:t>.</w:t>
@@ -568,8 +599,13 @@
         <w:t>Component</w:t>
       </w:r>
       <w:r>
-        <w:t>: EventComponent</w:t>
-      </w:r>
+        <w:t xml:space="preserve">: </w:t>
+      </w:r>
+      <w:proofErr w:type="spellStart"/>
+      <w:r>
+        <w:t>EventComponent</w:t>
+      </w:r>
+      <w:proofErr w:type="spellEnd"/>
     </w:p>
     <w:p>
       <w:pPr>
@@ -596,11 +632,21 @@
         <w:t>Demo Kiosk, Charging Station, Queue Management Point, First Aid Point</w:t>
       </w:r>
       <w:r>
-        <w:t xml:space="preserve">, Indie Booth, CosplayMeetupPoint, </w:t>
-      </w:r>
+        <w:t xml:space="preserve">, Indie Booth, </w:t>
+      </w:r>
+      <w:proofErr w:type="spellStart"/>
+      <w:r>
+        <w:t>CosplayMeetupPoint</w:t>
+      </w:r>
+      <w:proofErr w:type="spellEnd"/>
+      <w:r>
+        <w:t xml:space="preserve">, </w:t>
+      </w:r>
+      <w:proofErr w:type="spellStart"/>
       <w:r>
         <w:t>InfoDesk</w:t>
       </w:r>
+      <w:proofErr w:type="spellEnd"/>
     </w:p>
     <w:p>
       <w:pPr>
@@ -620,9 +666,67 @@
       <w:r>
         <w:t xml:space="preserve">: </w:t>
       </w:r>
-      <w:r>
-        <w:t>NexusCon, TournamentHall, MainArea, PracticeZone, ExpoFloor, PublisherRow, IndieAlley, CommunityZone</w:t>
-      </w:r>
+      <w:proofErr w:type="spellStart"/>
+      <w:r>
+        <w:t>NexusCon</w:t>
+      </w:r>
+      <w:proofErr w:type="spellEnd"/>
+      <w:r>
+        <w:t xml:space="preserve">, </w:t>
+      </w:r>
+      <w:proofErr w:type="spellStart"/>
+      <w:r>
+        <w:t>TournamentHall</w:t>
+      </w:r>
+      <w:proofErr w:type="spellEnd"/>
+      <w:r>
+        <w:t xml:space="preserve">, </w:t>
+      </w:r>
+      <w:proofErr w:type="spellStart"/>
+      <w:r>
+        <w:t>MainArea</w:t>
+      </w:r>
+      <w:proofErr w:type="spellEnd"/>
+      <w:r>
+        <w:t xml:space="preserve">, </w:t>
+      </w:r>
+      <w:proofErr w:type="spellStart"/>
+      <w:r>
+        <w:t>PracticeZone</w:t>
+      </w:r>
+      <w:proofErr w:type="spellEnd"/>
+      <w:r>
+        <w:t xml:space="preserve">, </w:t>
+      </w:r>
+      <w:proofErr w:type="spellStart"/>
+      <w:r>
+        <w:t>ExpoFloor</w:t>
+      </w:r>
+      <w:proofErr w:type="spellEnd"/>
+      <w:r>
+        <w:t xml:space="preserve">, </w:t>
+      </w:r>
+      <w:proofErr w:type="spellStart"/>
+      <w:r>
+        <w:t>PublisherRow</w:t>
+      </w:r>
+      <w:proofErr w:type="spellEnd"/>
+      <w:r>
+        <w:t xml:space="preserve">, </w:t>
+      </w:r>
+      <w:proofErr w:type="spellStart"/>
+      <w:r>
+        <w:t>IndieAlley</w:t>
+      </w:r>
+      <w:proofErr w:type="spellEnd"/>
+      <w:r>
+        <w:t xml:space="preserve">, </w:t>
+      </w:r>
+      <w:proofErr w:type="spellStart"/>
+      <w:r>
+        <w:t>CommunityZone</w:t>
+      </w:r>
+      <w:proofErr w:type="spellEnd"/>
     </w:p>
     <w:p>
       <w:pPr>
@@ -716,19 +820,97 @@
           <w:numId w:val="7"/>
         </w:numPr>
       </w:pPr>
+      <w:proofErr w:type="spellStart"/>
       <w:r>
         <w:rPr>
           <w:b/>
           <w:bCs/>
         </w:rPr>
-        <w:t>ConcreteSubject:</w:t>
-      </w:r>
-      <w:r>
-        <w:t xml:space="preserve"> EventControl, and each </w:t>
-      </w:r>
-      <w:r>
-        <w:t>of Nexuscon, TournamentHall, MainArea, PracticeZone, ExpoFloor, PublisherRow, IndieAlley, CommunityZone</w:t>
-      </w:r>
+        <w:t>ConcreteSubject</w:t>
+      </w:r>
+      <w:proofErr w:type="spellEnd"/>
+      <w:r>
+        <w:rPr>
+          <w:b/>
+          <w:bCs/>
+        </w:rPr>
+        <w:t>:</w:t>
+      </w:r>
+      <w:r>
+        <w:t xml:space="preserve"> </w:t>
+      </w:r>
+      <w:proofErr w:type="spellStart"/>
+      <w:r>
+        <w:t>EventControl</w:t>
+      </w:r>
+      <w:proofErr w:type="spellEnd"/>
+      <w:r>
+        <w:t xml:space="preserve">, and each </w:t>
+      </w:r>
+      <w:r>
+        <w:t xml:space="preserve">of </w:t>
+      </w:r>
+      <w:proofErr w:type="spellStart"/>
+      <w:r>
+        <w:t>Nexuscon</w:t>
+      </w:r>
+      <w:proofErr w:type="spellEnd"/>
+      <w:r>
+        <w:t xml:space="preserve">, </w:t>
+      </w:r>
+      <w:proofErr w:type="spellStart"/>
+      <w:r>
+        <w:t>TournamentHall</w:t>
+      </w:r>
+      <w:proofErr w:type="spellEnd"/>
+      <w:r>
+        <w:t xml:space="preserve">, </w:t>
+      </w:r>
+      <w:proofErr w:type="spellStart"/>
+      <w:r>
+        <w:t>MainArea</w:t>
+      </w:r>
+      <w:proofErr w:type="spellEnd"/>
+      <w:r>
+        <w:t xml:space="preserve">, </w:t>
+      </w:r>
+      <w:proofErr w:type="spellStart"/>
+      <w:r>
+        <w:t>PracticeZone</w:t>
+      </w:r>
+      <w:proofErr w:type="spellEnd"/>
+      <w:r>
+        <w:t xml:space="preserve">, </w:t>
+      </w:r>
+      <w:proofErr w:type="spellStart"/>
+      <w:r>
+        <w:t>ExpoFloor</w:t>
+      </w:r>
+      <w:proofErr w:type="spellEnd"/>
+      <w:r>
+        <w:t xml:space="preserve">, </w:t>
+      </w:r>
+      <w:proofErr w:type="spellStart"/>
+      <w:r>
+        <w:t>PublisherRow</w:t>
+      </w:r>
+      <w:proofErr w:type="spellEnd"/>
+      <w:r>
+        <w:t xml:space="preserve">, </w:t>
+      </w:r>
+      <w:proofErr w:type="spellStart"/>
+      <w:r>
+        <w:t>IndieAlley</w:t>
+      </w:r>
+      <w:proofErr w:type="spellEnd"/>
+      <w:r>
+        <w:t xml:space="preserve">, </w:t>
+      </w:r>
+      <w:proofErr w:type="spellStart"/>
+      <w:r>
+        <w:t>CommunityZone</w:t>
+      </w:r>
+      <w:proofErr w:type="spellEnd"/>
     </w:p>
     <w:p>
       <w:pPr>
@@ -738,25 +920,148 @@
           <w:numId w:val="7"/>
         </w:numPr>
       </w:pPr>
+      <w:proofErr w:type="spellStart"/>
       <w:r>
         <w:rPr>
           <w:b/>
           <w:bCs/>
         </w:rPr>
-        <w:t>ConcreteObject:</w:t>
+        <w:t>ConcreteObject</w:t>
+      </w:r>
+      <w:proofErr w:type="spellEnd"/>
+      <w:r>
+        <w:rPr>
+          <w:b/>
+          <w:bCs/>
+        </w:rPr>
+        <w:t>:</w:t>
       </w:r>
       <w:r>
         <w:t xml:space="preserve"> </w:t>
       </w:r>
-      <w:r>
-        <w:t>TournamentStage, CasterBooth,</w:t>
+      <w:proofErr w:type="spellStart"/>
+      <w:r>
+        <w:t>TournamentStage</w:t>
+      </w:r>
+      <w:proofErr w:type="spellEnd"/>
+      <w:r>
+        <w:t xml:space="preserve">, </w:t>
+      </w:r>
+      <w:proofErr w:type="spellStart"/>
+      <w:r>
+        <w:t>CasterBooth</w:t>
+      </w:r>
+      <w:proofErr w:type="spellEnd"/>
+      <w:r>
+        <w:t>,</w:t>
       </w:r>
       <w:r>
         <w:t xml:space="preserve"> Booth,</w:t>
       </w:r>
       <w:r>
-        <w:t xml:space="preserve"> DemoKiosk, IndieBooth, CosplayMeetupPoint, ChargingStation, FirstAidPoint, QueueManagementPoint, and each of TournamentHall, MainArena, PracticeZone, ExpoFloor, PublisherRow, IndieAlley, CommunityZone</w:t>
-      </w:r>
+        <w:t xml:space="preserve"> </w:t>
+      </w:r>
+      <w:proofErr w:type="spellStart"/>
+      <w:r>
+        <w:t>DemoKiosk</w:t>
+      </w:r>
+      <w:proofErr w:type="spellEnd"/>
+      <w:r>
+        <w:t xml:space="preserve">, </w:t>
+      </w:r>
+      <w:proofErr w:type="spellStart"/>
+      <w:r>
+        <w:t>IndieBooth</w:t>
+      </w:r>
+      <w:proofErr w:type="spellEnd"/>
+      <w:r>
+        <w:t xml:space="preserve">, </w:t>
+      </w:r>
+      <w:proofErr w:type="spellStart"/>
+      <w:r>
+        <w:t>CosplayMeetupPoint</w:t>
+      </w:r>
+      <w:proofErr w:type="spellEnd"/>
+      <w:r>
+        <w:t xml:space="preserve">, </w:t>
+      </w:r>
+      <w:proofErr w:type="spellStart"/>
+      <w:r>
+        <w:t>ChargingStation</w:t>
+      </w:r>
+      <w:proofErr w:type="spellEnd"/>
+      <w:r>
+        <w:t xml:space="preserve">, </w:t>
+      </w:r>
+      <w:proofErr w:type="spellStart"/>
+      <w:r>
+        <w:t>FirstAidPoint</w:t>
+      </w:r>
+      <w:proofErr w:type="spellEnd"/>
+      <w:r>
+        <w:t xml:space="preserve">, </w:t>
+      </w:r>
+      <w:proofErr w:type="spellStart"/>
+      <w:r>
+        <w:t>QueueManagementPoint</w:t>
+      </w:r>
+      <w:proofErr w:type="spellEnd"/>
+      <w:r>
+        <w:t xml:space="preserve">, and each of </w:t>
+      </w:r>
+      <w:proofErr w:type="spellStart"/>
+      <w:r>
+        <w:t>TournamentHall</w:t>
+      </w:r>
+      <w:proofErr w:type="spellEnd"/>
+      <w:r>
+        <w:t xml:space="preserve">, </w:t>
+      </w:r>
+      <w:proofErr w:type="spellStart"/>
+      <w:r>
+        <w:t>MainArena</w:t>
+      </w:r>
+      <w:proofErr w:type="spellEnd"/>
+      <w:r>
+        <w:t xml:space="preserve">, </w:t>
+      </w:r>
+      <w:proofErr w:type="spellStart"/>
+      <w:r>
+        <w:t>PracticeZone</w:t>
+      </w:r>
+      <w:proofErr w:type="spellEnd"/>
+      <w:r>
+        <w:t xml:space="preserve">, </w:t>
+      </w:r>
+      <w:proofErr w:type="spellStart"/>
+      <w:r>
+        <w:t>ExpoFloor</w:t>
+      </w:r>
+      <w:proofErr w:type="spellEnd"/>
+      <w:r>
+        <w:t xml:space="preserve">, </w:t>
+      </w:r>
+      <w:proofErr w:type="spellStart"/>
+      <w:r>
+        <w:t>PublisherRow</w:t>
+      </w:r>
+      <w:proofErr w:type="spellEnd"/>
+      <w:r>
+        <w:t xml:space="preserve">, </w:t>
+      </w:r>
+      <w:proofErr w:type="spellStart"/>
+      <w:r>
+        <w:t>IndieAlley</w:t>
+      </w:r>
+      <w:proofErr w:type="spellEnd"/>
+      <w:r>
+        <w:t xml:space="preserve">, </w:t>
+      </w:r>
+      <w:proofErr w:type="spellStart"/>
+      <w:r>
+        <w:t>CommunityZone</w:t>
+      </w:r>
+      <w:proofErr w:type="spellEnd"/>
     </w:p>
     <w:p/>
     <w:p>
@@ -785,8 +1090,13 @@
           <w:numId w:val="10"/>
         </w:numPr>
       </w:pPr>
-      <w:r>
-        <w:t>NexusCon:</w:t>
+      <w:proofErr w:type="spellStart"/>
+      <w:r>
+        <w:t>NexusCon</w:t>
+      </w:r>
+      <w:proofErr w:type="spellEnd"/>
+      <w:r>
+        <w:t>:</w:t>
       </w:r>
     </w:p>
     <w:p>
@@ -801,7 +1111,31 @@
         <w:t xml:space="preserve">Composite: </w:t>
       </w:r>
       <w:r>
-        <w:t>aggregates TournamentHall, ExpoFloor, CommunityZone as children</w:t>
+        <w:t xml:space="preserve">aggregates </w:t>
+      </w:r>
+      <w:proofErr w:type="spellStart"/>
+      <w:r>
+        <w:t>TournamentHall</w:t>
+      </w:r>
+      <w:proofErr w:type="spellEnd"/>
+      <w:r>
+        <w:t xml:space="preserve">, </w:t>
+      </w:r>
+      <w:proofErr w:type="spellStart"/>
+      <w:r>
+        <w:t>ExpoFloor</w:t>
+      </w:r>
+      <w:proofErr w:type="spellEnd"/>
+      <w:r>
+        <w:t xml:space="preserve">, </w:t>
+      </w:r>
+      <w:proofErr w:type="spellStart"/>
+      <w:r>
+        <w:t>CommunityZone</w:t>
+      </w:r>
+      <w:proofErr w:type="spellEnd"/>
+      <w:r>
+        <w:t xml:space="preserve"> as children</w:t>
       </w:r>
     </w:p>
     <w:p>
@@ -812,13 +1146,47 @@
           <w:numId w:val="11"/>
         </w:numPr>
       </w:pPr>
+      <w:proofErr w:type="spellStart"/>
       <w:r>
         <w:lastRenderedPageBreak/>
-        <w:t xml:space="preserve">ConcreteSubject: </w:t>
-      </w:r>
-      <w:r>
-        <w:t>When receiving alert, it calls notify() on TournamentHall, ExpoFloor, CommunityZone</w:t>
-      </w:r>
+        <w:t>ConcreteSubject</w:t>
+      </w:r>
+      <w:proofErr w:type="spellEnd"/>
+      <w:r>
+        <w:t xml:space="preserve">: </w:t>
+      </w:r>
+      <w:r>
+        <w:t xml:space="preserve">When receiving alert, it calls </w:t>
+      </w:r>
+      <w:proofErr w:type="gramStart"/>
+      <w:r>
+        <w:t>notify(</w:t>
+      </w:r>
+      <w:proofErr w:type="gramEnd"/>
+      <w:r>
+        <w:t xml:space="preserve">) on </w:t>
+      </w:r>
+      <w:proofErr w:type="spellStart"/>
+      <w:r>
+        <w:t>TournamentHall</w:t>
+      </w:r>
+      <w:proofErr w:type="spellEnd"/>
+      <w:r>
+        <w:t xml:space="preserve">, </w:t>
+      </w:r>
+      <w:proofErr w:type="spellStart"/>
+      <w:r>
+        <w:t>ExpoFloor</w:t>
+      </w:r>
+      <w:proofErr w:type="spellEnd"/>
+      <w:r>
+        <w:t xml:space="preserve">, </w:t>
+      </w:r>
+      <w:proofErr w:type="spellStart"/>
+      <w:r>
+        <w:t>CommunityZone</w:t>
+      </w:r>
+      <w:proofErr w:type="spellEnd"/>
     </w:p>
     <w:p>
       <w:pPr>
@@ -828,8 +1196,13 @@
           <w:numId w:val="10"/>
         </w:numPr>
       </w:pPr>
-      <w:r>
-        <w:t>TournamentHall:</w:t>
+      <w:proofErr w:type="spellStart"/>
+      <w:r>
+        <w:t>TournamentHall</w:t>
+      </w:r>
+      <w:proofErr w:type="spellEnd"/>
+      <w:r>
+        <w:t>:</w:t>
       </w:r>
     </w:p>
     <w:p>
@@ -841,7 +1214,23 @@
         </w:numPr>
       </w:pPr>
       <w:r>
-        <w:t>Composite: aggregates MainArea and PracticeZone as children</w:t>
+        <w:t xml:space="preserve">Composite: aggregates </w:t>
+      </w:r>
+      <w:proofErr w:type="spellStart"/>
+      <w:r>
+        <w:t>MainArea</w:t>
+      </w:r>
+      <w:proofErr w:type="spellEnd"/>
+      <w:r>
+        <w:t xml:space="preserve"> and </w:t>
+      </w:r>
+      <w:proofErr w:type="spellStart"/>
+      <w:r>
+        <w:t>PracticeZone</w:t>
+      </w:r>
+      <w:proofErr w:type="spellEnd"/>
+      <w:r>
+        <w:t xml:space="preserve"> as children</w:t>
       </w:r>
     </w:p>
     <w:p>
@@ -852,12 +1241,30 @@
           <w:numId w:val="14"/>
         </w:numPr>
       </w:pPr>
-      <w:r>
-        <w:t xml:space="preserve">ConcreteObserver: </w:t>
-      </w:r>
-      <w:r>
-        <w:t>reacts in its own update() when notified by Nexuscon</w:t>
-      </w:r>
+      <w:proofErr w:type="spellStart"/>
+      <w:r>
+        <w:t>ConcreteObserver</w:t>
+      </w:r>
+      <w:proofErr w:type="spellEnd"/>
+      <w:r>
+        <w:t xml:space="preserve">: </w:t>
+      </w:r>
+      <w:r>
+        <w:t xml:space="preserve">reacts in its own </w:t>
+      </w:r>
+      <w:proofErr w:type="gramStart"/>
+      <w:r>
+        <w:t>update(</w:t>
+      </w:r>
+      <w:proofErr w:type="gramEnd"/>
+      <w:r>
+        <w:t xml:space="preserve">) when notified by </w:t>
+      </w:r>
+      <w:proofErr w:type="spellStart"/>
+      <w:r>
+        <w:t>Nexuscon</w:t>
+      </w:r>
+      <w:proofErr w:type="spellEnd"/>
     </w:p>
     <w:p>
       <w:pPr>
@@ -867,11 +1274,53 @@
           <w:numId w:val="14"/>
         </w:numPr>
       </w:pPr>
-      <w:r>
-        <w:t xml:space="preserve">ConcreteSubject: </w:t>
-      </w:r>
-      <w:r>
-        <w:t>calls notify() on MainArea  and PracticeZone after handling its own update()</w:t>
+      <w:proofErr w:type="spellStart"/>
+      <w:r>
+        <w:t>ConcreteSubject</w:t>
+      </w:r>
+      <w:proofErr w:type="spellEnd"/>
+      <w:r>
+        <w:t xml:space="preserve">: </w:t>
+      </w:r>
+      <w:r>
+        <w:t xml:space="preserve">calls </w:t>
+      </w:r>
+      <w:proofErr w:type="gramStart"/>
+      <w:r>
+        <w:t>notify(</w:t>
+      </w:r>
+      <w:proofErr w:type="gramEnd"/>
+      <w:r>
+        <w:t xml:space="preserve">) on </w:t>
+      </w:r>
+      <w:proofErr w:type="spellStart"/>
+      <w:proofErr w:type="gramStart"/>
+      <w:r>
+        <w:t>MainArea</w:t>
+      </w:r>
+      <w:proofErr w:type="spellEnd"/>
+      <w:r>
+        <w:t xml:space="preserve">  and</w:t>
+      </w:r>
+      <w:proofErr w:type="gramEnd"/>
+      <w:r>
+        <w:t xml:space="preserve"> </w:t>
+      </w:r>
+      <w:proofErr w:type="spellStart"/>
+      <w:r>
+        <w:t>PracticeZone</w:t>
+      </w:r>
+      <w:proofErr w:type="spellEnd"/>
+      <w:r>
+        <w:t xml:space="preserve"> after handling its own </w:t>
+      </w:r>
+      <w:proofErr w:type="gramStart"/>
+      <w:r>
+        <w:t>update(</w:t>
+      </w:r>
+      <w:proofErr w:type="gramEnd"/>
+      <w:r>
+        <w:t>)</w:t>
       </w:r>
     </w:p>
     <w:p/>
@@ -883,8 +1332,13 @@
           <w:numId w:val="10"/>
         </w:numPr>
       </w:pPr>
-      <w:r>
-        <w:t>MainArea:</w:t>
+      <w:proofErr w:type="spellStart"/>
+      <w:r>
+        <w:t>MainArea</w:t>
+      </w:r>
+      <w:proofErr w:type="spellEnd"/>
+      <w:r>
+        <w:t>:</w:t>
       </w:r>
     </w:p>
     <w:p>
@@ -896,8 +1350,21 @@
         </w:numPr>
       </w:pPr>
       <w:r>
-        <w:t>Composite: aggregates TournamentStage and CasterBooth</w:t>
-      </w:r>
+        <w:t xml:space="preserve">Composite: aggregates </w:t>
+      </w:r>
+      <w:proofErr w:type="spellStart"/>
+      <w:r>
+        <w:t>TournamentStage</w:t>
+      </w:r>
+      <w:proofErr w:type="spellEnd"/>
+      <w:r>
+        <w:t xml:space="preserve"> and </w:t>
+      </w:r>
+      <w:proofErr w:type="spellStart"/>
+      <w:r>
+        <w:t>CasterBooth</w:t>
+      </w:r>
+      <w:proofErr w:type="spellEnd"/>
     </w:p>
     <w:p>
       <w:pPr>
@@ -907,12 +1374,22 @@
           <w:numId w:val="14"/>
         </w:numPr>
       </w:pPr>
-      <w:r>
-        <w:t>ConcreteObserver: re</w:t>
-      </w:r>
-      <w:r>
-        <w:t>gistered with TournamentHall</w:t>
-      </w:r>
+      <w:proofErr w:type="spellStart"/>
+      <w:r>
+        <w:t>ConcreteObserver</w:t>
+      </w:r>
+      <w:proofErr w:type="spellEnd"/>
+      <w:r>
+        <w:t>: re</w:t>
+      </w:r>
+      <w:r>
+        <w:t xml:space="preserve">gistered with </w:t>
+      </w:r>
+      <w:proofErr w:type="spellStart"/>
+      <w:r>
+        <w:t>TournamentHall</w:t>
+      </w:r>
+      <w:proofErr w:type="spellEnd"/>
     </w:p>
     <w:p>
       <w:pPr>
@@ -922,18 +1399,40 @@
           <w:numId w:val="14"/>
         </w:numPr>
       </w:pPr>
-      <w:r>
-        <w:t xml:space="preserve">ConcreteSubject: calls notify() on </w:t>
-      </w:r>
+      <w:proofErr w:type="spellStart"/>
+      <w:r>
+        <w:t>ConcreteSubject</w:t>
+      </w:r>
+      <w:proofErr w:type="spellEnd"/>
+      <w:r>
+        <w:t xml:space="preserve">: calls </w:t>
+      </w:r>
+      <w:proofErr w:type="gramStart"/>
+      <w:r>
+        <w:t>notify(</w:t>
+      </w:r>
+      <w:proofErr w:type="gramEnd"/>
+      <w:r>
+        <w:t xml:space="preserve">) on </w:t>
+      </w:r>
+      <w:proofErr w:type="spellStart"/>
+      <w:proofErr w:type="gramStart"/>
       <w:r>
         <w:t>TournamentStage</w:t>
       </w:r>
-      <w:r>
-        <w:t xml:space="preserve">  and </w:t>
-      </w:r>
+      <w:proofErr w:type="spellEnd"/>
+      <w:r>
+        <w:t xml:space="preserve">  and</w:t>
+      </w:r>
+      <w:proofErr w:type="gramEnd"/>
+      <w:r>
+        <w:t xml:space="preserve"> </w:t>
+      </w:r>
+      <w:proofErr w:type="spellStart"/>
       <w:r>
         <w:t>CasterBooth</w:t>
       </w:r>
+      <w:proofErr w:type="spellEnd"/>
       <w:r>
         <w:t xml:space="preserve"> </w:t>
       </w:r>
@@ -951,9 +1450,11 @@
           <w:numId w:val="10"/>
         </w:numPr>
       </w:pPr>
+      <w:proofErr w:type="spellStart"/>
       <w:r>
         <w:t>PracticeZone</w:t>
       </w:r>
+      <w:proofErr w:type="spellEnd"/>
       <w:r>
         <w:t>:</w:t>
       </w:r>
@@ -969,9 +1470,11 @@
       <w:r>
         <w:t xml:space="preserve">Composite: aggregates </w:t>
       </w:r>
+      <w:proofErr w:type="spellStart"/>
       <w:r>
         <w:t>PracticeBooth</w:t>
       </w:r>
+      <w:proofErr w:type="spellEnd"/>
     </w:p>
     <w:p>
       <w:pPr>
@@ -981,15 +1484,25 @@
           <w:numId w:val="14"/>
         </w:numPr>
       </w:pPr>
-      <w:r>
-        <w:t>ConcreteObserver: re</w:t>
+      <w:proofErr w:type="spellStart"/>
+      <w:r>
+        <w:t>ConcreteObserver</w:t>
+      </w:r>
+      <w:proofErr w:type="spellEnd"/>
+      <w:r>
+        <w:t>: re</w:t>
       </w:r>
       <w:r>
         <w:t xml:space="preserve">gistered </w:t>
       </w:r>
       <w:r>
-        <w:t>with TournamentHall</w:t>
-      </w:r>
+        <w:t xml:space="preserve">with </w:t>
+      </w:r>
+      <w:proofErr w:type="spellStart"/>
+      <w:r>
+        <w:t>TournamentHall</w:t>
+      </w:r>
+      <w:proofErr w:type="spellEnd"/>
     </w:p>
     <w:p>
       <w:pPr>
@@ -999,12 +1512,27 @@
           <w:numId w:val="14"/>
         </w:numPr>
       </w:pPr>
-      <w:r>
-        <w:t xml:space="preserve">ConcreteSubject: calls notify() on </w:t>
-      </w:r>
+      <w:proofErr w:type="spellStart"/>
+      <w:r>
+        <w:t>ConcreteSubject</w:t>
+      </w:r>
+      <w:proofErr w:type="spellEnd"/>
+      <w:r>
+        <w:t xml:space="preserve">: calls </w:t>
+      </w:r>
+      <w:proofErr w:type="gramStart"/>
+      <w:r>
+        <w:t>notify(</w:t>
+      </w:r>
+      <w:proofErr w:type="gramEnd"/>
+      <w:r>
+        <w:t xml:space="preserve">) on </w:t>
+      </w:r>
+      <w:proofErr w:type="spellStart"/>
       <w:r>
         <w:t>PracticeBooth</w:t>
       </w:r>
+      <w:proofErr w:type="spellEnd"/>
     </w:p>
     <w:p>
       <w:pPr>
@@ -1019,9 +1547,11 @@
           <w:numId w:val="10"/>
         </w:numPr>
       </w:pPr>
+      <w:proofErr w:type="spellStart"/>
       <w:r>
         <w:t>ExpoFloor</w:t>
       </w:r>
+      <w:proofErr w:type="spellEnd"/>
       <w:r>
         <w:t>:</w:t>
       </w:r>
@@ -1037,9 +1567,19 @@
       <w:r>
         <w:t xml:space="preserve">Composite: aggregates </w:t>
       </w:r>
-      <w:r>
-        <w:t>PublisherRow and IndieAlley</w:t>
-      </w:r>
+      <w:proofErr w:type="spellStart"/>
+      <w:r>
+        <w:t>PublisherRow</w:t>
+      </w:r>
+      <w:proofErr w:type="spellEnd"/>
+      <w:r>
+        <w:t xml:space="preserve"> and </w:t>
+      </w:r>
+      <w:proofErr w:type="spellStart"/>
+      <w:r>
+        <w:t>IndieAlley</w:t>
+      </w:r>
+      <w:proofErr w:type="spellEnd"/>
     </w:p>
     <w:p>
       <w:pPr>
@@ -1049,12 +1589,19 @@
           <w:numId w:val="14"/>
         </w:numPr>
       </w:pPr>
-      <w:r>
-        <w:t xml:space="preserve">ConcreteObserver: registered with </w:t>
-      </w:r>
+      <w:proofErr w:type="spellStart"/>
+      <w:r>
+        <w:t>ConcreteObserver</w:t>
+      </w:r>
+      <w:proofErr w:type="spellEnd"/>
+      <w:r>
+        <w:t xml:space="preserve">: registered with </w:t>
+      </w:r>
+      <w:proofErr w:type="spellStart"/>
       <w:r>
         <w:t>NexusCon</w:t>
       </w:r>
+      <w:proofErr w:type="spellEnd"/>
     </w:p>
     <w:p>
       <w:pPr>
@@ -1064,12 +1611,35 @@
           <w:numId w:val="14"/>
         </w:numPr>
       </w:pPr>
-      <w:r>
-        <w:t xml:space="preserve">ConcreteSubject: calls notify() on </w:t>
-      </w:r>
-      <w:r>
-        <w:t>PublisherRow and IndieAlley</w:t>
-      </w:r>
+      <w:proofErr w:type="spellStart"/>
+      <w:r>
+        <w:t>ConcreteSubject</w:t>
+      </w:r>
+      <w:proofErr w:type="spellEnd"/>
+      <w:r>
+        <w:t xml:space="preserve">: calls </w:t>
+      </w:r>
+      <w:proofErr w:type="gramStart"/>
+      <w:r>
+        <w:t>notify(</w:t>
+      </w:r>
+      <w:proofErr w:type="gramEnd"/>
+      <w:r>
+        <w:t xml:space="preserve">) on </w:t>
+      </w:r>
+      <w:proofErr w:type="spellStart"/>
+      <w:r>
+        <w:t>PublisherRow</w:t>
+      </w:r>
+      <w:proofErr w:type="spellEnd"/>
+      <w:r>
+        <w:t xml:space="preserve"> and </w:t>
+      </w:r>
+      <w:proofErr w:type="spellStart"/>
+      <w:r>
+        <w:t>IndieAlley</w:t>
+      </w:r>
+      <w:proofErr w:type="spellEnd"/>
     </w:p>
     <w:p>
       <w:pPr>
@@ -1084,9 +1654,11 @@
           <w:numId w:val="10"/>
         </w:numPr>
       </w:pPr>
+      <w:proofErr w:type="spellStart"/>
       <w:r>
         <w:t>PublisherRow</w:t>
       </w:r>
+      <w:proofErr w:type="spellEnd"/>
       <w:r>
         <w:t>:</w:t>
       </w:r>
@@ -1108,9 +1680,11 @@
       <w:r>
         <w:t xml:space="preserve"> </w:t>
       </w:r>
+      <w:proofErr w:type="spellStart"/>
       <w:r>
         <w:t>DemoKiosk</w:t>
       </w:r>
+      <w:proofErr w:type="spellEnd"/>
     </w:p>
     <w:p>
       <w:pPr>
@@ -1120,12 +1694,19 @@
           <w:numId w:val="14"/>
         </w:numPr>
       </w:pPr>
-      <w:r>
-        <w:t xml:space="preserve">ConcreteObserver: registered with </w:t>
-      </w:r>
+      <w:proofErr w:type="spellStart"/>
+      <w:r>
+        <w:t>ConcreteObserver</w:t>
+      </w:r>
+      <w:proofErr w:type="spellEnd"/>
+      <w:r>
+        <w:t xml:space="preserve">: registered with </w:t>
+      </w:r>
+      <w:proofErr w:type="spellStart"/>
       <w:r>
         <w:t>ExpoFloor</w:t>
       </w:r>
+      <w:proofErr w:type="spellEnd"/>
     </w:p>
     <w:p>
       <w:pPr>
@@ -1135,8 +1716,21 @@
           <w:numId w:val="14"/>
         </w:numPr>
       </w:pPr>
-      <w:r>
-        <w:t>ConcreteSubject: calls notify() on</w:t>
+      <w:proofErr w:type="spellStart"/>
+      <w:r>
+        <w:t>ConcreteSubject</w:t>
+      </w:r>
+      <w:proofErr w:type="spellEnd"/>
+      <w:r>
+        <w:t xml:space="preserve">: calls </w:t>
+      </w:r>
+      <w:proofErr w:type="gramStart"/>
+      <w:r>
+        <w:t>notify(</w:t>
+      </w:r>
+      <w:proofErr w:type="gramEnd"/>
+      <w:r>
+        <w:t>) on</w:t>
       </w:r>
       <w:r>
         <w:t xml:space="preserve"> Booth and</w:t>
@@ -1144,9 +1738,11 @@
       <w:r>
         <w:t xml:space="preserve"> </w:t>
       </w:r>
+      <w:proofErr w:type="spellStart"/>
       <w:r>
         <w:t>DemoKiosk</w:t>
       </w:r>
+      <w:proofErr w:type="spellEnd"/>
     </w:p>
     <w:p>
       <w:pPr>
@@ -1161,9 +1757,11 @@
           <w:numId w:val="10"/>
         </w:numPr>
       </w:pPr>
+      <w:proofErr w:type="spellStart"/>
       <w:r>
         <w:t>IndieAlley</w:t>
       </w:r>
+      <w:proofErr w:type="spellEnd"/>
       <w:r>
         <w:t>:</w:t>
       </w:r>
@@ -1179,9 +1777,11 @@
       <w:r>
         <w:t xml:space="preserve">Composite: aggregates </w:t>
       </w:r>
+      <w:proofErr w:type="spellStart"/>
       <w:r>
         <w:t>IndieBooth</w:t>
       </w:r>
+      <w:proofErr w:type="spellEnd"/>
     </w:p>
     <w:p>
       <w:pPr>
@@ -1191,12 +1791,19 @@
           <w:numId w:val="14"/>
         </w:numPr>
       </w:pPr>
-      <w:r>
-        <w:t xml:space="preserve">ConcreteObserver: registered with </w:t>
-      </w:r>
+      <w:proofErr w:type="spellStart"/>
+      <w:r>
+        <w:t>ConcreteObserver</w:t>
+      </w:r>
+      <w:proofErr w:type="spellEnd"/>
+      <w:r>
+        <w:t xml:space="preserve">: registered with </w:t>
+      </w:r>
+      <w:proofErr w:type="spellStart"/>
       <w:r>
         <w:t>ExpoFloor</w:t>
       </w:r>
+      <w:proofErr w:type="spellEnd"/>
     </w:p>
     <w:p>
       <w:pPr>
@@ -1206,12 +1813,27 @@
           <w:numId w:val="14"/>
         </w:numPr>
       </w:pPr>
-      <w:r>
-        <w:t xml:space="preserve">ConcreteSubject: calls notify() on </w:t>
-      </w:r>
+      <w:proofErr w:type="spellStart"/>
+      <w:r>
+        <w:t>ConcreteSubject</w:t>
+      </w:r>
+      <w:proofErr w:type="spellEnd"/>
+      <w:r>
+        <w:t xml:space="preserve">: calls </w:t>
+      </w:r>
+      <w:proofErr w:type="gramStart"/>
+      <w:r>
+        <w:t>notify(</w:t>
+      </w:r>
+      <w:proofErr w:type="gramEnd"/>
+      <w:r>
+        <w:t xml:space="preserve">) on </w:t>
+      </w:r>
+      <w:proofErr w:type="spellStart"/>
       <w:r>
         <w:t>IndieBooth</w:t>
       </w:r>
+      <w:proofErr w:type="spellEnd"/>
     </w:p>
     <w:p>
       <w:pPr>
@@ -1231,8 +1853,13 @@
           <w:numId w:val="10"/>
         </w:numPr>
       </w:pPr>
-      <w:r>
-        <w:t>CommunityZone:</w:t>
+      <w:proofErr w:type="spellStart"/>
+      <w:r>
+        <w:t>CommunityZone</w:t>
+      </w:r>
+      <w:proofErr w:type="spellEnd"/>
+      <w:r>
+        <w:t>:</w:t>
       </w:r>
     </w:p>
     <w:p>
@@ -1244,11 +1871,45 @@
         </w:numPr>
       </w:pPr>
       <w:r>
-        <w:t xml:space="preserve">Composite: aggregates CosplayMeetupPoint, </w:t>
-      </w:r>
-      <w:r>
-        <w:t>ChargingStation, InfoDesk, FirstAidPoint, QueueManagementPoint</w:t>
-      </w:r>
+        <w:t xml:space="preserve">Composite: aggregates </w:t>
+      </w:r>
+      <w:proofErr w:type="spellStart"/>
+      <w:r>
+        <w:t>CosplayMeetupPoint</w:t>
+      </w:r>
+      <w:proofErr w:type="spellEnd"/>
+      <w:r>
+        <w:t xml:space="preserve">, </w:t>
+      </w:r>
+      <w:proofErr w:type="spellStart"/>
+      <w:r>
+        <w:t>ChargingStation</w:t>
+      </w:r>
+      <w:proofErr w:type="spellEnd"/>
+      <w:r>
+        <w:t xml:space="preserve">, </w:t>
+      </w:r>
+      <w:proofErr w:type="spellStart"/>
+      <w:r>
+        <w:t>InfoDesk</w:t>
+      </w:r>
+      <w:proofErr w:type="spellEnd"/>
+      <w:r>
+        <w:t xml:space="preserve">, </w:t>
+      </w:r>
+      <w:proofErr w:type="spellStart"/>
+      <w:r>
+        <w:t>FirstAidPoint</w:t>
+      </w:r>
+      <w:proofErr w:type="spellEnd"/>
+      <w:r>
+        <w:t xml:space="preserve">, </w:t>
+      </w:r>
+      <w:proofErr w:type="spellStart"/>
+      <w:r>
+        <w:t>QueueManagementPoint</w:t>
+      </w:r>
+      <w:proofErr w:type="spellEnd"/>
     </w:p>
     <w:p>
       <w:pPr>
@@ -1258,12 +1919,19 @@
           <w:numId w:val="14"/>
         </w:numPr>
       </w:pPr>
-      <w:r>
-        <w:t xml:space="preserve">ConcreteObserver: registered with </w:t>
-      </w:r>
+      <w:proofErr w:type="spellStart"/>
+      <w:r>
+        <w:t>ConcreteObserver</w:t>
+      </w:r>
+      <w:proofErr w:type="spellEnd"/>
+      <w:r>
+        <w:t xml:space="preserve">: registered with </w:t>
+      </w:r>
+      <w:proofErr w:type="spellStart"/>
       <w:r>
         <w:t>NexusCon</w:t>
       </w:r>
+      <w:proofErr w:type="spellEnd"/>
     </w:p>
     <w:p>
       <w:pPr>
@@ -1273,8 +1941,21 @@
           <w:numId w:val="14"/>
         </w:numPr>
       </w:pPr>
-      <w:r>
-        <w:t xml:space="preserve">ConcreteSubject: calls notify() on </w:t>
+      <w:proofErr w:type="spellStart"/>
+      <w:r>
+        <w:t>ConcreteSubject</w:t>
+      </w:r>
+      <w:proofErr w:type="spellEnd"/>
+      <w:r>
+        <w:t xml:space="preserve">: calls </w:t>
+      </w:r>
+      <w:proofErr w:type="gramStart"/>
+      <w:r>
+        <w:t>notify(</w:t>
+      </w:r>
+      <w:proofErr w:type="gramEnd"/>
+      <w:r>
+        <w:t xml:space="preserve">) on </w:t>
       </w:r>
       <w:r>
         <w:t>its 5 children (stated above)</w:t>
@@ -1293,13 +1974,29 @@
         <w:t xml:space="preserve">a) </w:t>
       </w:r>
       <w:r>
-        <w:t>An EventGroup (e</w:t>
+        <w:t xml:space="preserve">An </w:t>
+      </w:r>
+      <w:proofErr w:type="spellStart"/>
+      <w:r>
+        <w:t>EventGroup</w:t>
+      </w:r>
+      <w:proofErr w:type="spellEnd"/>
+      <w:r>
+        <w:t xml:space="preserve"> (e</w:t>
       </w:r>
       <w:r>
         <w:t>.g.</w:t>
       </w:r>
       <w:r>
-        <w:t xml:space="preserve"> PublisherRow) does</w:t>
+        <w:t xml:space="preserve"> </w:t>
+      </w:r>
+      <w:proofErr w:type="spellStart"/>
+      <w:r>
+        <w:t>PublisherRow</w:t>
+      </w:r>
+      <w:proofErr w:type="spellEnd"/>
+      <w:r>
+        <w:t>) does</w:t>
       </w:r>
       <w:r>
         <w:t>n’t</w:t>
@@ -1311,13 +2008,39 @@
         <w:t>simpl</w:t>
       </w:r>
       <w:r>
-        <w:t xml:space="preserve">y reference its children — it cannot exist independently of the structure once built. Deleting PublisherRow should delete its Booth and Demo Kiosk instances (they have no independent lifetime outside their parent). Calling </w:t>
+        <w:t xml:space="preserve">y reference its children — it cannot exist independently of the structure once built. Deleting </w:t>
+      </w:r>
+      <w:proofErr w:type="spellStart"/>
+      <w:r>
+        <w:t>PublisherRow</w:t>
+      </w:r>
+      <w:proofErr w:type="spellEnd"/>
+      <w:r>
+        <w:t xml:space="preserve"> should delete its Booth and Demo Kiosk instances (they have no independent lifetime outside their parent). Calling </w:t>
       </w:r>
       <w:r>
         <w:t xml:space="preserve">a function like </w:t>
       </w:r>
-      <w:r>
-        <w:t xml:space="preserve">getCapacity() on PublisherRow produces a value </w:t>
+      <w:proofErr w:type="spellStart"/>
+      <w:proofErr w:type="gramStart"/>
+      <w:r>
+        <w:t>getCapacity</w:t>
+      </w:r>
+      <w:proofErr w:type="spellEnd"/>
+      <w:r>
+        <w:t>(</w:t>
+      </w:r>
+      <w:proofErr w:type="gramEnd"/>
+      <w:r>
+        <w:t xml:space="preserve">) on </w:t>
+      </w:r>
+      <w:proofErr w:type="spellStart"/>
+      <w:r>
+        <w:t>PublisherRow</w:t>
+      </w:r>
+      <w:proofErr w:type="spellEnd"/>
+      <w:r>
+        <w:t xml:space="preserve"> produces a value </w:t>
       </w:r>
       <w:r>
         <w:t>produced</w:t>
@@ -1357,14 +2080,64 @@
       <w:r>
         <w:t xml:space="preserve">b) </w:t>
       </w:r>
-      <w:r>
-        <w:t>EventControl (or any EventGroup) does not know in advance which leaves or sub-</w:t>
+      <w:proofErr w:type="spellStart"/>
+      <w:r>
+        <w:t>EventControl</w:t>
+      </w:r>
+      <w:proofErr w:type="spellEnd"/>
+      <w:r>
+        <w:t xml:space="preserve"> (or any </w:t>
+      </w:r>
+      <w:proofErr w:type="spellStart"/>
+      <w:r>
+        <w:t>EventGroup</w:t>
+      </w:r>
+      <w:proofErr w:type="spellEnd"/>
+      <w:r>
+        <w:t xml:space="preserve">) does not know in advance which </w:t>
+      </w:r>
+      <w:proofErr w:type="gramStart"/>
+      <w:r>
+        <w:t>leaves</w:t>
+      </w:r>
+      <w:proofErr w:type="gramEnd"/>
+      <w:r>
+        <w:t xml:space="preserve"> or sub-</w:t>
       </w:r>
       <w:r>
         <w:t>areas</w:t>
       </w:r>
       <w:r>
-        <w:t xml:space="preserve"> exist, how many there are, or which of them care about which alert type — that set changes at runtime (units close for the night and reopen, new booths can register). If EventControl hard-coded calls to TournamentStage::update(), Booth::update(), etc., it would need to know every concrete class, making the design impossible to extend without </w:t>
+        <w:t xml:space="preserve"> exist, how many there are, or which of them care about which alert type — that set changes at runtime (units close for the night and reopen, new booths can register). If </w:t>
+      </w:r>
+      <w:proofErr w:type="spellStart"/>
+      <w:r>
+        <w:t>EventControl</w:t>
+      </w:r>
+      <w:proofErr w:type="spellEnd"/>
+      <w:r>
+        <w:t xml:space="preserve"> hard-coded calls to </w:t>
+      </w:r>
+      <w:proofErr w:type="spellStart"/>
+      <w:proofErr w:type="gramStart"/>
+      <w:r>
+        <w:t>TournamentStage</w:t>
+      </w:r>
+      <w:proofErr w:type="spellEnd"/>
+      <w:r>
+        <w:t>::update(</w:t>
+      </w:r>
+      <w:proofErr w:type="gramEnd"/>
+      <w:r>
+        <w:t xml:space="preserve">), </w:t>
+      </w:r>
+      <w:proofErr w:type="gramStart"/>
+      <w:r>
+        <w:t>Booth::update(</w:t>
+      </w:r>
+      <w:proofErr w:type="gramEnd"/>
+      <w:r>
+        <w:t xml:space="preserve">), etc., it would need to know every concrete class, making the design impossible to extend without </w:t>
       </w:r>
       <w:r>
         <w:t>changing</w:t>
@@ -1376,7 +2149,15 @@
         <w:t>-</w:t>
       </w:r>
       <w:r>
-        <w:t>ordinator. Observer decouples the alert source from the alert recipients: the Subject only needs to know it holds a list of Observer*, and any new leaf type can participate simply by implementing Observer and calling attach() — no existing code changes.</w:t>
+        <w:t xml:space="preserve">ordinator. Observer decouples the alert source from the alert recipients: the Subject only needs to know it holds a list of Observer*, and any new leaf type can participate simply by implementing Observer and calling </w:t>
+      </w:r>
+      <w:proofErr w:type="gramStart"/>
+      <w:r>
+        <w:t>attach(</w:t>
+      </w:r>
+      <w:proofErr w:type="gramEnd"/>
+      <w:r>
+        <w:t>) — no existing code changes.</w:t>
       </w:r>
     </w:p>
     <w:p>
@@ -1391,14 +2172,27 @@
       <w:r>
         <w:t xml:space="preserve">c) </w:t>
       </w:r>
-      <w:r>
-        <w:t xml:space="preserve">EventGroup owns its children </w:t>
+      <w:proofErr w:type="spellStart"/>
+      <w:r>
+        <w:t>EventGroup</w:t>
+      </w:r>
+      <w:proofErr w:type="spellEnd"/>
+      <w:r>
+        <w:t xml:space="preserve"> owns its children </w:t>
       </w:r>
       <w:r>
         <w:t>using</w:t>
       </w:r>
       <w:r>
-        <w:t xml:space="preserve"> composition — it stores raw pointers to EventComponent and deletes them in its own destructor. </w:t>
+        <w:t xml:space="preserve"> composition — it stores raw pointers to </w:t>
+      </w:r>
+      <w:proofErr w:type="spellStart"/>
+      <w:r>
+        <w:t>EventComponent</w:t>
+      </w:r>
+      <w:proofErr w:type="spellEnd"/>
+      <w:r>
+        <w:t xml:space="preserve"> and deletes them in its own destructor. </w:t>
       </w:r>
     </w:p>
     <w:p>
@@ -1414,7 +2208,15 @@
         <w:t xml:space="preserve">d) </w:t>
       </w:r>
       <w:r>
-        <w:t xml:space="preserve">Subject does not own its observers. It holds Observer pointers purely to know who to notify, but the actual object lifetime is managed by the Composite ownership described above (an EventGroup node is often both a Composite-owned child </w:t>
+        <w:t xml:space="preserve">Subject does not own its observers. It holds Observer pointers purely to know who to notify, but the actual object lifetime is managed by the Composite ownership described above (an </w:t>
+      </w:r>
+      <w:proofErr w:type="spellStart"/>
+      <w:r>
+        <w:t>EventGroup</w:t>
+      </w:r>
+      <w:proofErr w:type="spellEnd"/>
+      <w:r>
+        <w:t xml:space="preserve"> node is often both a Composite-owned child </w:t>
       </w:r>
       <w:r>
         <w:t>and</w:t>
@@ -1449,7 +2251,15 @@
         <w:t>role</w:t>
       </w:r>
       <w:r>
-        <w:t xml:space="preserve"> with a distinct interface and a distinct set of collaborators. When TournamentHall acts as an </w:t>
+        <w:t xml:space="preserve"> with a distinct interface and a distinct set of collaborators. When </w:t>
+      </w:r>
+      <w:proofErr w:type="spellStart"/>
+      <w:r>
+        <w:t>TournamentHall</w:t>
+      </w:r>
+      <w:proofErr w:type="spellEnd"/>
+      <w:r>
+        <w:t xml:space="preserve"> acts as an </w:t>
       </w:r>
       <w:r>
         <w:t>Observer</w:t>
@@ -1461,7 +2271,23 @@
         <w:t>parent</w:t>
       </w:r>
       <w:r>
-        <w:t xml:space="preserve"> (NexusCon/EventControl)</w:t>
+        <w:t xml:space="preserve"> (</w:t>
+      </w:r>
+      <w:proofErr w:type="spellStart"/>
+      <w:r>
+        <w:t>NexusCon</w:t>
+      </w:r>
+      <w:proofErr w:type="spellEnd"/>
+      <w:r>
+        <w:t>/</w:t>
+      </w:r>
+      <w:proofErr w:type="spellStart"/>
+      <w:r>
+        <w:t>EventControl</w:t>
+      </w:r>
+      <w:proofErr w:type="spellEnd"/>
+      <w:r>
+        <w:t>)</w:t>
       </w:r>
       <w:r>
         <w:t>.</w:t>
@@ -1498,7 +2324,23 @@
         <w:t>other</w:t>
       </w:r>
       <w:r>
-        <w:t xml:space="preserve"> recipients. The patterns are not merged into one: update() and notify() </w:t>
+        <w:t xml:space="preserve"> recipients. The patterns are not merged into one: </w:t>
+      </w:r>
+      <w:proofErr w:type="gramStart"/>
+      <w:r>
+        <w:t>update(</w:t>
+      </w:r>
+      <w:proofErr w:type="gramEnd"/>
+      <w:r>
+        <w:t xml:space="preserve">) and </w:t>
+      </w:r>
+      <w:proofErr w:type="gramStart"/>
+      <w:r>
+        <w:t>notify(</w:t>
+      </w:r>
+      <w:proofErr w:type="gramEnd"/>
+      <w:r>
+        <w:t xml:space="preserve">) </w:t>
       </w:r>
       <w:r>
         <w:t>are</w:t>
@@ -1546,6 +2388,9 @@
         <w:t xml:space="preserve">2.3) </w:t>
       </w:r>
       <w:r>
+        <w:rPr>
+          <w:noProof/>
+        </w:rPr>
         <w:drawing>
           <wp:inline distT="0" distB="0" distL="0" distR="0" wp14:anchorId="2018F182" wp14:editId="77F5C78A">
             <wp:extent cx="5624482" cy="5549931"/>
@@ -1591,14 +2436,81 @@
       <w:r>
         <w:t xml:space="preserve">Calling delete </w:t>
       </w:r>
+      <w:proofErr w:type="spellStart"/>
       <w:r>
         <w:t>N</w:t>
       </w:r>
       <w:r>
-        <w:t>exusCon invokes EventGroup::~EventGroup(), which iterates its children vector and calls delete on each pointer. Because TournamentHall, ExpoFloor, and CommunityZone are themselves EventGroup-derived objects, deleting them triggers the same destructor recursively on their own children</w:t>
-      </w:r>
-      <w:r>
-        <w:t xml:space="preserve"> (C</w:t>
+        <w:t>exusCon</w:t>
+      </w:r>
+      <w:proofErr w:type="spellEnd"/>
+      <w:r>
+        <w:t xml:space="preserve"> invokes </w:t>
+      </w:r>
+      <w:proofErr w:type="spellStart"/>
+      <w:proofErr w:type="gramStart"/>
+      <w:r>
+        <w:t>EventGroup</w:t>
+      </w:r>
+      <w:proofErr w:type="spellEnd"/>
+      <w:r>
+        <w:t>::</w:t>
+      </w:r>
+      <w:proofErr w:type="gramEnd"/>
+      <w:r>
+        <w:t>~</w:t>
+      </w:r>
+      <w:proofErr w:type="spellStart"/>
+      <w:proofErr w:type="gramStart"/>
+      <w:r>
+        <w:t>EventGroup</w:t>
+      </w:r>
+      <w:proofErr w:type="spellEnd"/>
+      <w:r>
+        <w:t>(</w:t>
+      </w:r>
+      <w:proofErr w:type="gramEnd"/>
+      <w:r>
+        <w:t xml:space="preserve">), which iterates its children vector and calls delete on each pointer. Because </w:t>
+      </w:r>
+      <w:proofErr w:type="spellStart"/>
+      <w:r>
+        <w:t>TournamentHall</w:t>
+      </w:r>
+      <w:proofErr w:type="spellEnd"/>
+      <w:r>
+        <w:t xml:space="preserve">, </w:t>
+      </w:r>
+      <w:proofErr w:type="spellStart"/>
+      <w:r>
+        <w:t>ExpoFloor</w:t>
+      </w:r>
+      <w:proofErr w:type="spellEnd"/>
+      <w:r>
+        <w:t xml:space="preserve">, and </w:t>
+      </w:r>
+      <w:proofErr w:type="spellStart"/>
+      <w:r>
+        <w:t>CommunityZone</w:t>
+      </w:r>
+      <w:proofErr w:type="spellEnd"/>
+      <w:r>
+        <w:t xml:space="preserve"> are themselves </w:t>
+      </w:r>
+      <w:proofErr w:type="spellStart"/>
+      <w:r>
+        <w:t>EventGroup</w:t>
+      </w:r>
+      <w:proofErr w:type="spellEnd"/>
+      <w:r>
+        <w:t>-derived objects, deleting them triggers the same destructor recursively on their own children</w:t>
+      </w:r>
+      <w:r>
+        <w:t xml:space="preserve"> (</w:t>
+      </w:r>
+      <w:proofErr w:type="spellStart"/>
+      <w:r>
+        <w:t>C</w:t>
       </w:r>
       <w:r>
         <w:t>aster</w:t>
@@ -1606,25 +2518,92 @@
       <w:r>
         <w:t>Booth</w:t>
       </w:r>
+      <w:proofErr w:type="spellEnd"/>
       <w:r>
         <w:t>,</w:t>
       </w:r>
       <w:r>
-        <w:t xml:space="preserve"> P</w:t>
-      </w:r>
-      <w:r>
-        <w:t xml:space="preserve">ublisherRow, </w:t>
-      </w:r>
+        <w:t xml:space="preserve"> </w:t>
+      </w:r>
+      <w:proofErr w:type="spellStart"/>
+      <w:r>
+        <w:t>P</w:t>
+      </w:r>
+      <w:r>
+        <w:t>ublisherRow</w:t>
+      </w:r>
+      <w:proofErr w:type="spellEnd"/>
+      <w:r>
+        <w:t xml:space="preserve">, </w:t>
+      </w:r>
+      <w:proofErr w:type="spellStart"/>
       <w:r>
         <w:t>I</w:t>
       </w:r>
       <w:r>
-        <w:t>ndieAlley, etc.), which continues down to the leaves (TournamentStage, Booth, DemoKiosk, and so on), where ~EventUnit() and each leaf's own destructor run.</w:t>
-      </w:r>
-    </w:p>
-    <w:p>
-      <w:r>
-        <w:t>Every object is deleted exactly once because every EventComponent* in the tree is stored in the children vector of exactly one parent — no object is ever add()ed to two different EventGroups simultaneously in this design. Since ownership is</w:t>
+        <w:t>ndieAlley</w:t>
+      </w:r>
+      <w:proofErr w:type="spellEnd"/>
+      <w:r>
+        <w:t>, etc.), which continues down to the leaves (</w:t>
+      </w:r>
+      <w:proofErr w:type="spellStart"/>
+      <w:r>
+        <w:t>TournamentStage</w:t>
+      </w:r>
+      <w:proofErr w:type="spellEnd"/>
+      <w:r>
+        <w:t xml:space="preserve">, Booth, </w:t>
+      </w:r>
+      <w:proofErr w:type="spellStart"/>
+      <w:r>
+        <w:t>DemoKiosk</w:t>
+      </w:r>
+      <w:proofErr w:type="spellEnd"/>
+      <w:r>
+        <w:t>, and so on), where ~</w:t>
+      </w:r>
+      <w:proofErr w:type="spellStart"/>
+      <w:proofErr w:type="gramStart"/>
+      <w:r>
+        <w:t>EventUnit</w:t>
+      </w:r>
+      <w:proofErr w:type="spellEnd"/>
+      <w:r>
+        <w:t>(</w:t>
+      </w:r>
+      <w:proofErr w:type="gramEnd"/>
+      <w:r>
+        <w:t>) and each leaf's own destructor run.</w:t>
+      </w:r>
+    </w:p>
+    <w:p>
+      <w:r>
+        <w:t xml:space="preserve">Every object is deleted exactly once because every </w:t>
+      </w:r>
+      <w:proofErr w:type="spellStart"/>
+      <w:r>
+        <w:t>EventComponent</w:t>
+      </w:r>
+      <w:proofErr w:type="spellEnd"/>
+      <w:r>
+        <w:t xml:space="preserve">* in the tree is stored in the children vector of exactly one parent — no object is ever </w:t>
+      </w:r>
+      <w:proofErr w:type="gramStart"/>
+      <w:r>
+        <w:t>add(</w:t>
+      </w:r>
+      <w:proofErr w:type="gramEnd"/>
+      <w:r>
+        <w:t xml:space="preserve">)ed to two different </w:t>
+      </w:r>
+      <w:proofErr w:type="spellStart"/>
+      <w:r>
+        <w:t>EventGroups</w:t>
+      </w:r>
+      <w:proofErr w:type="spellEnd"/>
+      <w:r>
+        <w:t xml:space="preserve"> simultaneously in this design. Since ownership is</w:t>
       </w:r>
       <w:r>
         <w:t xml:space="preserve"> </w:t>
@@ -1647,7 +2626,15 @@
     </w:p>
     <w:p>
       <w:r>
-        <w:t>This is also why Subject's destructor (on TournamentHall, etc.) is safe alongside this: it only clears its observers list, it never calls delete on the pointers it holds — because those same objects</w:t>
+        <w:t xml:space="preserve">This is also why Subject's destructor (on </w:t>
+      </w:r>
+      <w:proofErr w:type="spellStart"/>
+      <w:r>
+        <w:t>TournamentHall</w:t>
+      </w:r>
+      <w:proofErr w:type="spellEnd"/>
+      <w:r>
+        <w:t>, etc.) is safe alongside this: it only clears its observers list, it never calls delete on the pointers it holds — because those same objects</w:t>
       </w:r>
       <w:r>
         <w:t xml:space="preserve"> </w:t>
@@ -1659,17 +2646,20 @@
         <w:t>also</w:t>
       </w:r>
       <w:r>
-        <w:t xml:space="preserve"> Composite-owned children elsewhere in the tree, and deleting them a second time via the observer list would cause a double-free. This is precisely why 1.4(d)'s ownership split (Composite owns, Subject does not) </w:t>
+        <w:t xml:space="preserve"> Composite-owned children elsewhere in the </w:t>
+      </w:r>
+      <w:proofErr w:type="gramStart"/>
+      <w:r>
+        <w:t>tree, and</w:t>
+      </w:r>
+      <w:proofErr w:type="gramEnd"/>
+      <w:r>
+        <w:t xml:space="preserve"> deleting them a second time via the observer list would cause a double-free. This is precisely why 1.4(d)'s ownership split (Composite owns, Subject does not) </w:t>
       </w:r>
       <w:r>
         <w:t>is important.</w:t>
       </w:r>
     </w:p>
-    <w:p/>
-    <w:p/>
-    <w:p/>
-    <w:p/>
-    <w:p/>
     <w:p>
       <w:pPr>
         <w:pStyle w:val="Heading1"/>
@@ -1685,13 +2675,938 @@
           <w:bCs/>
           <w:u w:val="single"/>
         </w:rPr>
+        <w:t>Task 3:</w:t>
+      </w:r>
+    </w:p>
+    <w:p>
+      <w:r>
+        <w:t>3.1</w:t>
+      </w:r>
+    </w:p>
+    <w:p>
+      <w:r>
+        <w:t>The abstract Subject class provides core lifecycle management for registered observers using an internal container (</w:t>
+      </w:r>
+      <w:proofErr w:type="gramStart"/>
+      <w:r>
+        <w:t>std::</w:t>
+      </w:r>
+      <w:proofErr w:type="gramEnd"/>
+      <w:r>
+        <w:t>vector&lt;Observer*&gt; observers).</w:t>
+      </w:r>
+    </w:p>
+    <w:p>
+      <w:r>
+        <w:t xml:space="preserve">-Registration Policy (attach): To prevent duplicate registrations, </w:t>
+      </w:r>
+      <w:proofErr w:type="gramStart"/>
+      <w:r>
+        <w:t>Subject::</w:t>
+      </w:r>
+      <w:proofErr w:type="gramEnd"/>
+      <w:r>
+        <w:t xml:space="preserve">attach executes a search check using </w:t>
+      </w:r>
+      <w:proofErr w:type="gramStart"/>
+      <w:r>
+        <w:t>std::</w:t>
+      </w:r>
+      <w:proofErr w:type="gramEnd"/>
+      <w:r>
+        <w:t>find prior to Insertion. If the observer pointer is already present in the collection, the registration attempt is ignored.</w:t>
+      </w:r>
+    </w:p>
+    <w:p>
+      <w:r>
+        <w:t xml:space="preserve">-Deregistration Policy (detach): If a call to detach passes an observer pointer that is not registered, the system performs a lookup via </w:t>
+      </w:r>
+      <w:proofErr w:type="gramStart"/>
+      <w:r>
+        <w:t>std::</w:t>
+      </w:r>
+      <w:proofErr w:type="gramEnd"/>
+      <w:r>
+        <w:t>find. If the pointer is missing, detach completes without raising an exception.</w:t>
+      </w:r>
+    </w:p>
+    <w:p/>
+    <w:p>
+      <w:r>
+        <w:t>3.2</w:t>
+      </w:r>
+    </w:p>
+    <w:p>
+      <w:r>
+        <w:t>The Observer abstraction defines a pure virtual interface (update) to enforce polymorphic handling across concrete observers.</w:t>
+      </w:r>
+    </w:p>
+    <w:p>
+      <w:r>
+        <w:t xml:space="preserve">Policy: To prevent dangling references when objects are destroyed, the architecture uses </w:t>
+      </w:r>
+      <w:proofErr w:type="spellStart"/>
+      <w:r>
+        <w:t>Compisite</w:t>
+      </w:r>
+      <w:proofErr w:type="spellEnd"/>
+      <w:r>
+        <w:t>-Managed Lifetime Scoping:</w:t>
+      </w:r>
+    </w:p>
+    <w:p>
+      <w:pPr>
+        <w:pStyle w:val="ListParagraph"/>
+        <w:numPr>
+          <w:ilvl w:val="0"/>
+          <w:numId w:val="16"/>
+        </w:numPr>
+      </w:pPr>
+      <w:r>
+        <w:t>Intermediate composite nodes (</w:t>
+      </w:r>
+      <w:proofErr w:type="spellStart"/>
+      <w:r>
+        <w:t>EventGroup</w:t>
+      </w:r>
+      <w:proofErr w:type="spellEnd"/>
+      <w:r>
+        <w:t>) manage child lifelines.</w:t>
+      </w:r>
+    </w:p>
+    <w:p>
+      <w:pPr>
+        <w:pStyle w:val="ListParagraph"/>
+        <w:numPr>
+          <w:ilvl w:val="0"/>
+          <w:numId w:val="16"/>
+        </w:numPr>
+      </w:pPr>
+      <w:r>
+        <w:lastRenderedPageBreak/>
+        <w:t xml:space="preserve">When an </w:t>
+      </w:r>
+      <w:proofErr w:type="spellStart"/>
+      <w:r>
+        <w:t>EventGroup</w:t>
+      </w:r>
+      <w:proofErr w:type="spellEnd"/>
+      <w:r>
+        <w:t xml:space="preserve"> composite is destroyed, its destructor recursively frees child components.</w:t>
+      </w:r>
+    </w:p>
+    <w:p>
+      <w:pPr>
+        <w:pStyle w:val="ListParagraph"/>
+        <w:numPr>
+          <w:ilvl w:val="0"/>
+          <w:numId w:val="16"/>
+        </w:numPr>
+      </w:pPr>
+      <w:r>
+        <w:t xml:space="preserve">Prior to deletion, observers are explicitly detached from their parent Subject using </w:t>
+      </w:r>
+      <w:proofErr w:type="gramStart"/>
+      <w:r>
+        <w:t>Subject::detach(</w:t>
+      </w:r>
+      <w:proofErr w:type="gramEnd"/>
+      <w:r>
+        <w:t>).</w:t>
+      </w:r>
+    </w:p>
+    <w:p>
+      <w:pPr>
+        <w:pStyle w:val="ListParagraph"/>
+        <w:numPr>
+          <w:ilvl w:val="0"/>
+          <w:numId w:val="16"/>
+        </w:numPr>
+      </w:pPr>
+      <w:r>
+        <w:t xml:space="preserve">The base Subject destructor executes </w:t>
+      </w:r>
+      <w:proofErr w:type="spellStart"/>
+      <w:proofErr w:type="gramStart"/>
+      <w:r>
+        <w:t>observers.clear</w:t>
+      </w:r>
+      <w:proofErr w:type="spellEnd"/>
+      <w:proofErr w:type="gramEnd"/>
+      <w:r>
+        <w:t>() to invalidate any remaining tracking references, ensuring no dangling pointers.</w:t>
+      </w:r>
+    </w:p>
+    <w:p>
+      <w:r>
+        <w:t>3.5</w:t>
+      </w:r>
+    </w:p>
+    <w:p>
+      <w:r>
+        <w:t xml:space="preserve">The system uses a Push Model, passing a reference directly into </w:t>
+      </w:r>
+      <w:proofErr w:type="gramStart"/>
+      <w:r>
+        <w:t>Observer::</w:t>
+      </w:r>
+      <w:proofErr w:type="gramEnd"/>
+      <w:r>
+        <w:t>update(..)</w:t>
+      </w:r>
+    </w:p>
+    <w:p>
+      <w:r>
+        <w:t>Pros: Observers do not need accessors or back-references to inspect concrete Subject internals. (</w:t>
+      </w:r>
+      <w:proofErr w:type="gramStart"/>
+      <w:r>
+        <w:t>Loose</w:t>
+      </w:r>
+      <w:proofErr w:type="gramEnd"/>
+      <w:r>
+        <w:t xml:space="preserve"> Coupling)</w:t>
+      </w:r>
+    </w:p>
+    <w:p>
+      <w:r>
+        <w:t>Cons: Observers receive the uniform notice payload regardless of whether all state details are required by that specific component.</w:t>
+      </w:r>
+    </w:p>
+    <w:p>
+      <w:r>
+        <w:t>Transferred state:</w:t>
+      </w:r>
+      <w:r>
+        <w:t xml:space="preserve"> </w:t>
+      </w:r>
+      <w:proofErr w:type="spellStart"/>
+      <w:proofErr w:type="gramStart"/>
+      <w:r>
+        <w:t>notice.getMessage</w:t>
+      </w:r>
+      <w:proofErr w:type="spellEnd"/>
+      <w:proofErr w:type="gramEnd"/>
+      <w:r>
+        <w:t>() (</w:t>
+      </w:r>
+      <w:proofErr w:type="gramStart"/>
+      <w:r>
+        <w:t>std::</w:t>
+      </w:r>
+      <w:proofErr w:type="gramEnd"/>
+      <w:r>
+        <w:t>string)</w:t>
+      </w:r>
+      <w:r>
+        <w:br/>
+      </w:r>
+      <w:r>
+        <w:t xml:space="preserve">                                      </w:t>
+      </w:r>
+      <w:proofErr w:type="spellStart"/>
+      <w:proofErr w:type="gramStart"/>
+      <w:r>
+        <w:t>notice.getSeverity</w:t>
+      </w:r>
+      <w:proofErr w:type="spellEnd"/>
+      <w:proofErr w:type="gramEnd"/>
+      <w:r>
+        <w:t>() (int)</w:t>
+      </w:r>
+    </w:p>
+    <w:p>
+      <w:pPr>
+        <w:pStyle w:val="Heading1"/>
+        <w:rPr>
+          <w:b/>
+          <w:bCs/>
+          <w:u w:val="single"/>
+        </w:rPr>
+      </w:pPr>
+      <w:r>
+        <w:rPr>
+          <w:b/>
+          <w:bCs/>
+          <w:u w:val="single"/>
+        </w:rPr>
+        <w:t>Task 4:</w:t>
+      </w:r>
+    </w:p>
+    <w:p>
+      <w:r>
+        <w:t>4.1</w:t>
+      </w:r>
+    </w:p>
+    <w:tbl>
+      <w:tblPr>
+        <w:tblStyle w:val="TableGrid"/>
+        <w:tblW w:w="9165" w:type="dxa"/>
+        <w:tblLook w:val="04A0" w:firstRow="1" w:lastRow="0" w:firstColumn="1" w:lastColumn="0" w:noHBand="0" w:noVBand="1"/>
+      </w:tblPr>
+      <w:tblGrid>
+        <w:gridCol w:w="1724"/>
+        <w:gridCol w:w="2882"/>
+        <w:gridCol w:w="4559"/>
+      </w:tblGrid>
+      <w:tr>
+        <w:trPr>
+          <w:trHeight w:val="321"/>
+        </w:trPr>
+        <w:tc>
+          <w:tcPr>
+            <w:tcW w:w="1724" w:type="dxa"/>
+          </w:tcPr>
+          <w:p>
+            <w:pPr>
+              <w:rPr>
+                <w:b/>
+                <w:bCs/>
+                <w:sz w:val="28"/>
+                <w:szCs w:val="28"/>
+              </w:rPr>
+            </w:pPr>
+            <w:r>
+              <w:rPr>
+                <w:b/>
+                <w:bCs/>
+                <w:sz w:val="28"/>
+                <w:szCs w:val="28"/>
+              </w:rPr>
+              <w:t>Event Rule</w:t>
+            </w:r>
+          </w:p>
+        </w:tc>
+        <w:tc>
+          <w:tcPr>
+            <w:tcW w:w="2882" w:type="dxa"/>
+          </w:tcPr>
+          <w:p>
+            <w:pPr>
+              <w:rPr>
+                <w:b/>
+                <w:bCs/>
+                <w:sz w:val="28"/>
+                <w:szCs w:val="28"/>
+              </w:rPr>
+            </w:pPr>
+            <w:r>
+              <w:rPr>
+                <w:b/>
+                <w:bCs/>
+                <w:sz w:val="28"/>
+                <w:szCs w:val="28"/>
+              </w:rPr>
+              <w:t>Target Concrete Unit</w:t>
+            </w:r>
+          </w:p>
+        </w:tc>
+        <w:tc>
+          <w:tcPr>
+            <w:tcW w:w="4559" w:type="dxa"/>
+          </w:tcPr>
+          <w:p>
+            <w:pPr>
+              <w:rPr>
+                <w:b/>
+                <w:bCs/>
+                <w:sz w:val="28"/>
+                <w:szCs w:val="28"/>
+              </w:rPr>
+            </w:pPr>
+            <w:r>
+              <w:rPr>
+                <w:b/>
+                <w:bCs/>
+                <w:sz w:val="28"/>
+                <w:szCs w:val="28"/>
+              </w:rPr>
+              <w:t>Polymorphic Reaction</w:t>
+            </w:r>
+          </w:p>
+        </w:tc>
+      </w:tr>
+      <w:tr>
+        <w:trPr>
+          <w:trHeight w:val="2575"/>
+        </w:trPr>
+        <w:tc>
+          <w:tcPr>
+            <w:tcW w:w="1724" w:type="dxa"/>
+          </w:tcPr>
+          <w:p>
+            <w:r>
+              <w:t xml:space="preserve">Rule 1: Evacuation Notice </w:t>
+            </w:r>
+          </w:p>
+        </w:tc>
+        <w:tc>
+          <w:tcPr>
+            <w:tcW w:w="2882" w:type="dxa"/>
+          </w:tcPr>
+          <w:p>
+            <w:proofErr w:type="spellStart"/>
+            <w:r>
+              <w:t>TournamentStage</w:t>
+            </w:r>
+            <w:proofErr w:type="spellEnd"/>
+          </w:p>
+          <w:p/>
+          <w:p/>
+          <w:p/>
+          <w:p>
+            <w:proofErr w:type="spellStart"/>
+            <w:r>
+              <w:t>FirstAidPoint</w:t>
+            </w:r>
+            <w:proofErr w:type="spellEnd"/>
+          </w:p>
+          <w:p/>
+          <w:p/>
+          <w:p/>
+          <w:p>
+            <w:proofErr w:type="spellStart"/>
+            <w:r>
+              <w:t>DemoKiosk</w:t>
+            </w:r>
+            <w:proofErr w:type="spellEnd"/>
+          </w:p>
+        </w:tc>
+        <w:tc>
+          <w:tcPr>
+            <w:tcW w:w="4559" w:type="dxa"/>
+          </w:tcPr>
+          <w:p>
+            <w:r>
+              <w:t>Immediately halts live matches (</w:t>
+            </w:r>
+            <w:proofErr w:type="spellStart"/>
+            <w:r>
+              <w:t>matchInProgress</w:t>
+            </w:r>
+            <w:proofErr w:type="spellEnd"/>
+            <w:r>
+              <w:t xml:space="preserve"> = false), and invokes </w:t>
+            </w:r>
+            <w:proofErr w:type="gramStart"/>
+            <w:r>
+              <w:t>close(</w:t>
+            </w:r>
+            <w:proofErr w:type="gramEnd"/>
+            <w:r>
+              <w:t>)</w:t>
+            </w:r>
+          </w:p>
+          <w:p/>
+          <w:p>
+            <w:r>
+              <w:t>Ignores general closure instructions; transitions to emergency mode (</w:t>
+            </w:r>
+            <w:proofErr w:type="spellStart"/>
+            <w:r>
+              <w:t>isEmergencyMode</w:t>
+            </w:r>
+            <w:proofErr w:type="spellEnd"/>
+            <w:r>
+              <w:t xml:space="preserve"> = true) </w:t>
+            </w:r>
+          </w:p>
+          <w:p/>
+          <w:p>
+            <w:r>
+              <w:t>Locks inventory counters (</w:t>
+            </w:r>
+            <w:proofErr w:type="spellStart"/>
+            <w:r>
+              <w:t>isOpen</w:t>
+            </w:r>
+            <w:proofErr w:type="spellEnd"/>
+            <w:r>
+              <w:t xml:space="preserve"> = false)</w:t>
+            </w:r>
+          </w:p>
+        </w:tc>
+      </w:tr>
+      <w:tr>
+        <w:trPr>
+          <w:trHeight w:val="1990"/>
+        </w:trPr>
+        <w:tc>
+          <w:tcPr>
+            <w:tcW w:w="1724" w:type="dxa"/>
+          </w:tcPr>
+          <w:p>
+            <w:r>
+              <w:t xml:space="preserve">Rule 2: Technical Outage </w:t>
+            </w:r>
+          </w:p>
+        </w:tc>
+        <w:tc>
+          <w:tcPr>
+            <w:tcW w:w="2882" w:type="dxa"/>
+          </w:tcPr>
+          <w:p>
+            <w:proofErr w:type="spellStart"/>
+            <w:r>
+              <w:t>CasterBooth</w:t>
+            </w:r>
+            <w:proofErr w:type="spellEnd"/>
+          </w:p>
+          <w:p/>
+          <w:p/>
+          <w:p/>
+          <w:p>
+            <w:proofErr w:type="spellStart"/>
+            <w:r>
+              <w:t>ChargingStation</w:t>
+            </w:r>
+            <w:proofErr w:type="spellEnd"/>
+          </w:p>
+        </w:tc>
+        <w:tc>
+          <w:tcPr>
+            <w:tcW w:w="4559" w:type="dxa"/>
+          </w:tcPr>
+          <w:p>
+            <w:r>
+              <w:t>Suspends live stream broadcasting (</w:t>
+            </w:r>
+            <w:proofErr w:type="spellStart"/>
+            <w:r>
+              <w:t>isLive</w:t>
+            </w:r>
+            <w:proofErr w:type="spellEnd"/>
+            <w:r>
+              <w:t xml:space="preserve"> = false), switches output feed to emergency stream backup.</w:t>
+            </w:r>
+          </w:p>
+          <w:p/>
+          <w:p>
+            <w:r>
+              <w:t>Cuts auxiliary power ports (</w:t>
+            </w:r>
+            <w:proofErr w:type="spellStart"/>
+            <w:r>
+              <w:t>activePorts</w:t>
+            </w:r>
+            <w:proofErr w:type="spellEnd"/>
+            <w:r>
+              <w:t xml:space="preserve"> = 0), reserving internal battery power exclusively for safety systems.</w:t>
+            </w:r>
+          </w:p>
+        </w:tc>
+      </w:tr>
+      <w:tr>
+        <w:trPr>
+          <w:trHeight w:val="848"/>
+        </w:trPr>
+        <w:tc>
+          <w:tcPr>
+            <w:tcW w:w="1724" w:type="dxa"/>
+          </w:tcPr>
+          <w:p>
+            <w:r>
+              <w:t xml:space="preserve">Rule 3: Capacity Warning </w:t>
+            </w:r>
+          </w:p>
+        </w:tc>
+        <w:tc>
+          <w:tcPr>
+            <w:tcW w:w="2882" w:type="dxa"/>
+          </w:tcPr>
+          <w:p>
+            <w:proofErr w:type="spellStart"/>
+            <w:r>
+              <w:t>QueueManagementPoint</w:t>
+            </w:r>
+            <w:proofErr w:type="spellEnd"/>
+          </w:p>
+          <w:p/>
+          <w:p/>
+          <w:p/>
+          <w:p>
+            <w:proofErr w:type="spellStart"/>
+            <w:r>
+              <w:t>CosplayMeetup</w:t>
+            </w:r>
+            <w:proofErr w:type="spellEnd"/>
+          </w:p>
+        </w:tc>
+        <w:tc>
+          <w:tcPr>
+            <w:tcW w:w="4559" w:type="dxa"/>
+          </w:tcPr>
+          <w:p>
+            <w:r>
+              <w:t>Restricts new entry queues (</w:t>
+            </w:r>
+            <w:proofErr w:type="spellStart"/>
+            <w:r>
+              <w:t>queueLength</w:t>
+            </w:r>
+            <w:proofErr w:type="spellEnd"/>
+            <w:r>
+              <w:t xml:space="preserve"> capped), activates temporary overflow stations.</w:t>
+            </w:r>
+          </w:p>
+          <w:p/>
+          <w:p>
+            <w:r>
+              <w:lastRenderedPageBreak/>
+              <w:t>Suspends scheduled group photo shoots, broadcasts crowd-redistribution announcements.</w:t>
+            </w:r>
+          </w:p>
+        </w:tc>
+      </w:tr>
+      <w:tr>
+        <w:trPr>
+          <w:trHeight w:val="140"/>
+        </w:trPr>
+        <w:tc>
+          <w:tcPr>
+            <w:tcW w:w="1724" w:type="dxa"/>
+          </w:tcPr>
+          <w:p>
+            <w:r>
+              <w:lastRenderedPageBreak/>
+              <w:t xml:space="preserve">Rule 4: Resumption Notice </w:t>
+            </w:r>
+          </w:p>
+        </w:tc>
+        <w:tc>
+          <w:tcPr>
+            <w:tcW w:w="2882" w:type="dxa"/>
+          </w:tcPr>
+          <w:p>
+            <w:proofErr w:type="spellStart"/>
+            <w:r>
+              <w:t>TournamentStage</w:t>
+            </w:r>
+            <w:proofErr w:type="spellEnd"/>
+          </w:p>
+          <w:p/>
+          <w:p/>
+          <w:p>
+            <w:proofErr w:type="spellStart"/>
+            <w:r>
+              <w:t>DemoKiosk</w:t>
+            </w:r>
+            <w:proofErr w:type="spellEnd"/>
+          </w:p>
+        </w:tc>
+        <w:tc>
+          <w:tcPr>
+            <w:tcW w:w="4559" w:type="dxa"/>
+          </w:tcPr>
+          <w:p>
+            <w:r>
+              <w:t>Restores match routines (</w:t>
+            </w:r>
+            <w:proofErr w:type="spellStart"/>
+            <w:r>
+              <w:t>matchInProgress</w:t>
+            </w:r>
+            <w:proofErr w:type="spellEnd"/>
+            <w:r>
+              <w:t xml:space="preserve"> = true).</w:t>
+            </w:r>
+          </w:p>
+          <w:p/>
+          <w:p>
+            <w:r>
+              <w:t xml:space="preserve">Sets </w:t>
+            </w:r>
+            <w:proofErr w:type="spellStart"/>
+            <w:r>
+              <w:t>poweredUnits</w:t>
+            </w:r>
+            <w:proofErr w:type="spellEnd"/>
+            <w:r>
+              <w:t xml:space="preserve"> to </w:t>
+            </w:r>
+            <w:proofErr w:type="spellStart"/>
+            <w:r>
+              <w:t>TotalUnits</w:t>
+            </w:r>
+            <w:proofErr w:type="spellEnd"/>
+            <w:r>
+              <w:t>.</w:t>
+            </w:r>
+          </w:p>
+        </w:tc>
+      </w:tr>
+      <w:tr>
+        <w:trPr>
+          <w:trHeight w:val="140"/>
+        </w:trPr>
+        <w:tc>
+          <w:tcPr>
+            <w:tcW w:w="1724" w:type="dxa"/>
+          </w:tcPr>
+          <w:p>
+            <w:r>
+              <w:t xml:space="preserve">Rule 5: Queue Overflow Alert </w:t>
+            </w:r>
+          </w:p>
+        </w:tc>
+        <w:tc>
+          <w:tcPr>
+            <w:tcW w:w="2882" w:type="dxa"/>
+          </w:tcPr>
+          <w:p>
+            <w:proofErr w:type="spellStart"/>
+            <w:r>
+              <w:t>CosplayMeetupPoint</w:t>
+            </w:r>
+            <w:proofErr w:type="spellEnd"/>
+          </w:p>
+        </w:tc>
+        <w:tc>
+          <w:tcPr>
+            <w:tcW w:w="4559" w:type="dxa"/>
+          </w:tcPr>
+          <w:p>
+            <w:r>
+              <w:t>Redirects excess attendees to secondary photo areas.</w:t>
+            </w:r>
+          </w:p>
+        </w:tc>
+      </w:tr>
+      <w:tr>
+        <w:trPr>
+          <w:trHeight w:val="848"/>
+        </w:trPr>
+        <w:tc>
+          <w:tcPr>
+            <w:tcW w:w="1724" w:type="dxa"/>
+          </w:tcPr>
+          <w:p>
+            <w:r>
+              <w:t xml:space="preserve">Rule 6: Open Notice </w:t>
+            </w:r>
+          </w:p>
+        </w:tc>
+        <w:tc>
+          <w:tcPr>
+            <w:tcW w:w="2882" w:type="dxa"/>
+          </w:tcPr>
+          <w:p>
+            <w:r>
+              <w:t xml:space="preserve">Booth / </w:t>
+            </w:r>
+            <w:proofErr w:type="spellStart"/>
+            <w:r>
+              <w:t>DemoKiosk</w:t>
+            </w:r>
+            <w:proofErr w:type="spellEnd"/>
+          </w:p>
+          <w:p/>
+          <w:p/>
+        </w:tc>
+        <w:tc>
+          <w:tcPr>
+            <w:tcW w:w="4559" w:type="dxa"/>
+          </w:tcPr>
+          <w:p>
+            <w:r>
+              <w:t>Unlocks display stands, initializes interactive software, and sets status to active (</w:t>
+            </w:r>
+            <w:proofErr w:type="spellStart"/>
+            <w:r>
+              <w:t>isOpen</w:t>
+            </w:r>
+            <w:proofErr w:type="spellEnd"/>
+            <w:r>
+              <w:t xml:space="preserve"> = true)</w:t>
+            </w:r>
+          </w:p>
+        </w:tc>
+      </w:tr>
+    </w:tbl>
+    <w:p>
+      <w:r>
+        <w:t>4.4</w:t>
+      </w:r>
+    </w:p>
+    <w:p>
+      <w:r>
+        <w:t xml:space="preserve">1. Dynamic Power Grid </w:t>
+      </w:r>
+      <w:proofErr w:type="gramStart"/>
+      <w:r>
+        <w:t>Throttling(</w:t>
+      </w:r>
+      <w:proofErr w:type="spellStart"/>
+      <w:proofErr w:type="gramEnd"/>
+      <w:r>
+        <w:t>DemoKiosk</w:t>
+      </w:r>
+      <w:proofErr w:type="spellEnd"/>
+      <w:r>
+        <w:t>):</w:t>
+      </w:r>
+      <w:r>
+        <w:br/>
+      </w:r>
+      <w:r>
+        <w:tab/>
+        <w:t>Operates hardware units at 50% (</w:t>
+      </w:r>
+      <w:proofErr w:type="spellStart"/>
+      <w:r>
+        <w:t>poweredUnits</w:t>
+      </w:r>
+      <w:proofErr w:type="spellEnd"/>
+      <w:r>
+        <w:t xml:space="preserve"> = </w:t>
+      </w:r>
+      <w:proofErr w:type="spellStart"/>
+      <w:r>
+        <w:t>totalUnits</w:t>
+      </w:r>
+      <w:proofErr w:type="spellEnd"/>
+      <w:r>
+        <w:t>/2) upon receiving</w:t>
+      </w:r>
+      <w:r>
+        <w:br/>
+      </w:r>
+      <w:r>
+        <w:tab/>
+        <w:t>a technical outage</w:t>
+      </w:r>
+      <w:r>
+        <w:br/>
+      </w:r>
+      <w:r>
+        <w:tab/>
+        <w:t xml:space="preserve">No-God: Calculations are scoped locally inside </w:t>
+      </w:r>
+      <w:proofErr w:type="spellStart"/>
+      <w:r>
+        <w:t>DemoKiosk</w:t>
+      </w:r>
+      <w:proofErr w:type="spellEnd"/>
+      <w:r>
+        <w:t xml:space="preserve"> using its internal</w:t>
+      </w:r>
+      <w:r>
+        <w:br/>
+      </w:r>
+      <w:r>
+        <w:tab/>
+        <w:t>state attributes.</w:t>
+      </w:r>
+    </w:p>
+    <w:p>
+      <w:r>
+        <w:t>2. Stream Sync Protocol:</w:t>
+      </w:r>
+    </w:p>
+    <w:p>
+      <w:pPr>
+        <w:ind w:left="720"/>
+      </w:pPr>
+      <w:r>
+        <w:t>Pauses match clocks and dispatch stream standby overlays upon Technical</w:t>
+      </w:r>
+      <w:r>
+        <w:br/>
+        <w:t>outage.</w:t>
+      </w:r>
+      <w:r>
+        <w:br/>
+        <w:t xml:space="preserve">No-God: Logic is fully self-contained inside </w:t>
+      </w:r>
+      <w:proofErr w:type="spellStart"/>
+      <w:proofErr w:type="gramStart"/>
+      <w:r>
+        <w:t>TournamentStage</w:t>
+      </w:r>
+      <w:proofErr w:type="spellEnd"/>
+      <w:r>
+        <w:t>::update(</w:t>
+      </w:r>
+      <w:proofErr w:type="gramEnd"/>
+      <w:r>
+        <w:t>).</w:t>
+      </w:r>
+    </w:p>
+    <w:p>
+      <w:r>
+        <w:t>3.Cosplay Safety Priority Beacon (</w:t>
+      </w:r>
+      <w:proofErr w:type="spellStart"/>
+      <w:r>
+        <w:t>CosplayMeetupPoint</w:t>
+      </w:r>
+      <w:proofErr w:type="spellEnd"/>
+      <w:r>
+        <w:t>):</w:t>
+      </w:r>
+    </w:p>
+    <w:p>
+      <w:r>
+        <w:tab/>
+        <w:t xml:space="preserve">Triggers high-visibility safety beacons during </w:t>
+      </w:r>
+      <w:proofErr w:type="spellStart"/>
+      <w:r>
+        <w:t>QueueOverflowAlert</w:t>
+      </w:r>
+      <w:proofErr w:type="spellEnd"/>
+      <w:r>
+        <w:t xml:space="preserve"> to guide </w:t>
+      </w:r>
+      <w:r>
+        <w:br/>
+      </w:r>
+      <w:r>
+        <w:tab/>
+        <w:t>attendees.</w:t>
+      </w:r>
+      <w:r>
+        <w:br/>
+      </w:r>
+      <w:r>
+        <w:tab/>
+        <w:t xml:space="preserve">No-God: Logic inside </w:t>
+      </w:r>
+      <w:proofErr w:type="spellStart"/>
+      <w:r>
+        <w:t>CosplayMeetupPoint</w:t>
+      </w:r>
+      <w:proofErr w:type="spellEnd"/>
+      <w:r>
+        <w:t>.</w:t>
+      </w:r>
+    </w:p>
+    <w:p>
+      <w:pPr>
+        <w:pStyle w:val="Heading1"/>
+        <w:rPr>
+          <w:b/>
+          <w:bCs/>
+          <w:u w:val="single"/>
+        </w:rPr>
+      </w:pPr>
+      <w:r>
+        <w:rPr>
+          <w:b/>
+          <w:bCs/>
+          <w:u w:val="single"/>
+        </w:rPr>
+        <w:lastRenderedPageBreak/>
         <w:t>Task 5:</w:t>
       </w:r>
     </w:p>
     <w:p>
       <w:r>
+        <w:rPr>
+          <w:noProof/>
+        </w:rPr>
         <w:drawing>
-          <wp:anchor distT="0" distB="0" distL="114300" distR="114300" simplePos="0" relativeHeight="251658240" behindDoc="1" locked="0" layoutInCell="1" allowOverlap="1" wp14:anchorId="068472BA" wp14:editId="3084BB06">
+          <wp:anchor distT="0" distB="0" distL="114300" distR="114300" simplePos="0" relativeHeight="251658240" behindDoc="1" locked="0" layoutInCell="1" allowOverlap="1" wp14:anchorId="068472BA" wp14:editId="1CD38ACA">
             <wp:simplePos x="0" y="0"/>
             <wp:positionH relativeFrom="margin">
               <wp:align>center</wp:align>
@@ -1699,9 +3614,9 @@
             <wp:positionV relativeFrom="paragraph">
               <wp:posOffset>204643</wp:posOffset>
             </wp:positionV>
-            <wp:extent cx="7398581" cy="2144683"/>
-            <wp:effectExtent l="0" t="0" r="0" b="8255"/>
-            <wp:wrapNone/>
+            <wp:extent cx="7397587" cy="2721935"/>
+            <wp:effectExtent l="0" t="0" r="0" b="2540"/>
+            <wp:wrapSquare wrapText="bothSides"/>
             <wp:docPr id="598388384" name="Picture 1"/>
             <wp:cNvGraphicFramePr>
               <a:graphicFrameLocks xmlns:a="http://schemas.openxmlformats.org/drawingml/2006/main" noChangeAspect="1"/>
@@ -1728,7 +3643,7 @@
                   <pic:spPr>
                     <a:xfrm>
                       <a:off x="0" y="0"/>
-                      <a:ext cx="7398581" cy="2144683"/>
+                      <a:ext cx="7415918" cy="2728680"/>
                     </a:xfrm>
                     <a:prstGeom prst="rect">
                       <a:avLst/>
@@ -1748,6 +3663,121 @@
       </w:r>
       <w:r>
         <w:t xml:space="preserve">5.1) </w:t>
+      </w:r>
+    </w:p>
+    <w:p/>
+    <w:p/>
+    <w:p/>
+    <w:p/>
+    <w:p>
+      <w:r>
+        <w:t>5.2)</w:t>
+      </w:r>
+      <w:r>
+        <w:rPr>
+          <w:noProof/>
+        </w:rPr>
+        <w:t xml:space="preserve"> </w:t>
+      </w:r>
+    </w:p>
+    <w:p>
+      <w:r>
+        <w:rPr>
+          <w:noProof/>
+        </w:rPr>
+        <w:drawing>
+          <wp:inline distT="0" distB="0" distL="0" distR="0" wp14:anchorId="66490C3D" wp14:editId="25802CB1">
+            <wp:extent cx="5731510" cy="2182495"/>
+            <wp:effectExtent l="0" t="0" r="2540" b="8255"/>
+            <wp:docPr id="2141434555" name="Picture 1"/>
+            <wp:cNvGraphicFramePr>
+              <a:graphicFrameLocks xmlns:a="http://schemas.openxmlformats.org/drawingml/2006/main" noChangeAspect="1"/>
+            </wp:cNvGraphicFramePr>
+            <a:graphic xmlns:a="http://schemas.openxmlformats.org/drawingml/2006/main">
+              <a:graphicData uri="http://schemas.openxmlformats.org/drawingml/2006/picture">
+                <pic:pic xmlns:pic="http://schemas.openxmlformats.org/drawingml/2006/picture">
+                  <pic:nvPicPr>
+                    <pic:cNvPr id="2141434555" name="Picture 2141434555"/>
+                    <pic:cNvPicPr/>
+                  </pic:nvPicPr>
+                  <pic:blipFill>
+                    <a:blip r:embed="rId7">
+                      <a:extLst>
+                        <a:ext uri="{28A0092B-C50C-407E-A947-70E740481C1C}">
+                          <a14:useLocalDpi xmlns:a14="http://schemas.microsoft.com/office/drawing/2010/main" val="0"/>
+                        </a:ext>
+                      </a:extLst>
+                    </a:blip>
+                    <a:stretch>
+                      <a:fillRect/>
+                    </a:stretch>
+                  </pic:blipFill>
+                  <pic:spPr>
+                    <a:xfrm>
+                      <a:off x="0" y="0"/>
+                      <a:ext cx="5731510" cy="2182495"/>
+                    </a:xfrm>
+                    <a:prstGeom prst="rect">
+                      <a:avLst/>
+                    </a:prstGeom>
+                  </pic:spPr>
+                </pic:pic>
+              </a:graphicData>
+            </a:graphic>
+          </wp:inline>
+        </w:drawing>
+      </w:r>
+    </w:p>
+    <w:p>
+      <w:r>
+        <w:lastRenderedPageBreak/>
+        <w:t>5.3</w:t>
+      </w:r>
+      <w:r>
+        <w:rPr>
+          <w:noProof/>
+        </w:rPr>
+        <w:drawing>
+          <wp:inline distT="0" distB="0" distL="0" distR="0" wp14:anchorId="64E8FB50" wp14:editId="68F0CC8F">
+            <wp:extent cx="5731510" cy="5949315"/>
+            <wp:effectExtent l="0" t="0" r="2540" b="0"/>
+            <wp:docPr id="202045952" name="Picture 2"/>
+            <wp:cNvGraphicFramePr>
+              <a:graphicFrameLocks xmlns:a="http://schemas.openxmlformats.org/drawingml/2006/main" noChangeAspect="1"/>
+            </wp:cNvGraphicFramePr>
+            <a:graphic xmlns:a="http://schemas.openxmlformats.org/drawingml/2006/main">
+              <a:graphicData uri="http://schemas.openxmlformats.org/drawingml/2006/picture">
+                <pic:pic xmlns:pic="http://schemas.openxmlformats.org/drawingml/2006/picture">
+                  <pic:nvPicPr>
+                    <pic:cNvPr id="202045952" name="Picture 202045952"/>
+                    <pic:cNvPicPr/>
+                  </pic:nvPicPr>
+                  <pic:blipFill>
+                    <a:blip r:embed="rId8">
+                      <a:extLst>
+                        <a:ext uri="{28A0092B-C50C-407E-A947-70E740481C1C}">
+                          <a14:useLocalDpi xmlns:a14="http://schemas.microsoft.com/office/drawing/2010/main" val="0"/>
+                        </a:ext>
+                      </a:extLst>
+                    </a:blip>
+                    <a:stretch>
+                      <a:fillRect/>
+                    </a:stretch>
+                  </pic:blipFill>
+                  <pic:spPr>
+                    <a:xfrm>
+                      <a:off x="0" y="0"/>
+                      <a:ext cx="5731510" cy="5949315"/>
+                    </a:xfrm>
+                    <a:prstGeom prst="rect">
+                      <a:avLst/>
+                    </a:prstGeom>
+                  </pic:spPr>
+                </pic:pic>
+              </a:graphicData>
+            </a:graphic>
+          </wp:inline>
+        </w:drawing>
       </w:r>
     </w:p>
     <w:p/>
@@ -1768,10 +3798,6 @@
     <w:p/>
     <w:p/>
     <w:p/>
-    <w:p/>
-    <w:p/>
-    <w:p/>
-    <w:p/>
     <w:p>
       <w:pPr>
         <w:rPr>
@@ -1794,8 +3820,13 @@
       </w:r>
     </w:p>
     <w:p>
-      <w:r>
-        <w:t xml:space="preserve">NexusCon (root) </w:t>
+      <w:proofErr w:type="spellStart"/>
+      <w:r>
+        <w:t>NexusCon</w:t>
+      </w:r>
+      <w:proofErr w:type="spellEnd"/>
+      <w:r>
+        <w:t xml:space="preserve"> (root) </w:t>
       </w:r>
     </w:p>
     <w:p>
@@ -1929,60 +3960,60 @@
     </w:p>
     <w:p>
       <w:r>
+        <w:t xml:space="preserve">| </w:t>
+      </w:r>
+      <w:r>
+        <w:tab/>
+      </w:r>
+      <w:r>
+        <w:t xml:space="preserve">| </w:t>
+      </w:r>
+      <w:r>
+        <w:tab/>
+      </w:r>
+      <w:r>
+        <w:t xml:space="preserve">+-- Demo Kiosk </w:t>
+      </w:r>
+    </w:p>
+    <w:p>
+      <w:r>
+        <w:t xml:space="preserve">| </w:t>
+      </w:r>
+      <w:r>
+        <w:tab/>
+      </w:r>
+      <w:r>
+        <w:t xml:space="preserve">| </w:t>
+      </w:r>
+    </w:p>
+    <w:p>
+      <w:r>
+        <w:t xml:space="preserve">| </w:t>
+      </w:r>
+      <w:r>
+        <w:tab/>
+      </w:r>
+      <w:r>
+        <w:t xml:space="preserve">+-- Indie Alley </w:t>
+      </w:r>
+    </w:p>
+    <w:p>
+      <w:r>
+        <w:t xml:space="preserve">| </w:t>
+      </w:r>
+      <w:r>
+        <w:tab/>
+      </w:r>
+      <w:r>
+        <w:tab/>
+      </w:r>
+      <w:r>
+        <w:t xml:space="preserve">+-- Indie Booth </w:t>
+      </w:r>
+    </w:p>
+    <w:p>
+      <w:r>
         <w:lastRenderedPageBreak/>
-        <w:t xml:space="preserve">| </w:t>
-      </w:r>
-      <w:r>
-        <w:tab/>
-      </w:r>
-      <w:r>
-        <w:t xml:space="preserve">| </w:t>
-      </w:r>
-      <w:r>
-        <w:tab/>
-      </w:r>
-      <w:r>
-        <w:t xml:space="preserve">+-- Demo Kiosk </w:t>
-      </w:r>
-    </w:p>
-    <w:p>
-      <w:r>
-        <w:t xml:space="preserve">| </w:t>
-      </w:r>
-      <w:r>
-        <w:tab/>
-      </w:r>
-      <w:r>
-        <w:t xml:space="preserve">| </w:t>
-      </w:r>
-    </w:p>
-    <w:p>
-      <w:r>
-        <w:t xml:space="preserve">| </w:t>
-      </w:r>
-      <w:r>
-        <w:tab/>
-      </w:r>
-      <w:r>
-        <w:t xml:space="preserve">+-- Indie Alley </w:t>
-      </w:r>
-    </w:p>
-    <w:p>
-      <w:r>
-        <w:t xml:space="preserve">| </w:t>
-      </w:r>
-      <w:r>
-        <w:tab/>
-      </w:r>
-      <w:r>
-        <w:tab/>
-      </w:r>
-      <w:r>
-        <w:t xml:space="preserve">+-- Indie Booth </w:t>
-      </w:r>
-    </w:p>
-    <w:p>
-      <w:r>
         <w:t xml:space="preserve">| </w:t>
       </w:r>
     </w:p>
@@ -2042,7 +4073,7 @@
 </file>
 
 <file path=word/numbering.xml><?xml version="1.0" encoding="utf-8"?>
-<w:numbering xmlns:wpc="http://schemas.microsoft.com/office/word/2010/wordprocessingCanvas" xmlns:cx="http://schemas.microsoft.com/office/drawing/2014/chartex" xmlns:cx1="http://schemas.microsoft.com/office/drawing/2015/9/8/chartex" xmlns:cx2="http://schemas.microsoft.com/office/drawing/2015/10/21/chartex" xmlns:cx3="http://schemas.microsoft.com/office/drawing/2016/5/9/chartex" xmlns:cx4="http://schemas.microsoft.com/office/drawing/2016/5/10/chartex" xmlns:cx5="http://schemas.microsoft.com/office/drawing/2016/5/11/chartex" xmlns:cx6="http://schemas.microsoft.com/office/drawing/2016/5/12/chartex" xmlns:cx7="http://schemas.microsoft.com/office/drawing/2016/5/13/chartex" xmlns:cx8="http://schemas.microsoft.com/office/drawing/2016/5/14/chartex" xmlns:mc="http://schemas.openxmlformats.org/markup-compatibility/2006" xmlns:aink="http://schemas.microsoft.com/office/drawing/2016/ink" xmlns:am3d="http://schemas.microsoft.com/office/drawing/2017/model3d" xmlns:o="urn:schemas-microsoft-com:office:office" xmlns:oel="http://schemas.microsoft.com/office/2019/extlst" xmlns:r="http://schemas.openxmlformats.org/officeDocument/2006/relationships" xmlns:m="http://schemas.openxmlformats.org/officeDocument/2006/math" xmlns:v="urn:schemas-microsoft-com:vml" xmlns:wp14="http://schemas.microsoft.com/office/word/2010/wordprocessingDrawing" xmlns:wp="http://schemas.openxmlformats.org/drawingml/2006/wordprocessingDrawing" xmlns:w10="urn:schemas-microsoft-com:office:word" xmlns:w="http://schemas.openxmlformats.org/wordprocessingml/2006/main" xmlns:w14="http://schemas.microsoft.com/office/word/2010/wordml" xmlns:w15="http://schemas.microsoft.com/office/word/2012/wordml" xmlns:w16cei="http://schemas.microsoft.com/office/word/2026/wordml/cei" xmlns:w16cex="http://schemas.microsoft.com/office/word/2018/wordml/cex" xmlns:w16cid="http://schemas.microsoft.com/office/word/2016/wordml/cid" xmlns:w16="http://schemas.microsoft.com/office/word/2018/wordml" xmlns:w16du="http://schemas.microsoft.com/office/word/2023/wordml/word16du" xmlns:w16sdtdh="http://schemas.microsoft.com/office/word/2020/wordml/sdtdatahash" xmlns:w16sdtfl="http://schemas.microsoft.com/office/word/2024/wordml/sdtformatlock" xmlns:w16se="http://schemas.microsoft.com/office/word/2015/wordml/symex" xmlns:wpg="http://schemas.microsoft.com/office/word/2010/wordprocessingGroup" xmlns:wpi="http://schemas.microsoft.com/office/word/2010/wordprocessingInk" xmlns:wne="http://schemas.microsoft.com/office/word/2006/wordml" xmlns:wps="http://schemas.microsoft.com/office/word/2010/wordprocessingShape" mc:Ignorable="w14 w15 w16se w16cid w16 w16cex w16sdtdh w16sdtfl w16du wp14">
+<w:numbering xmlns:wpc="http://schemas.microsoft.com/office/word/2010/wordprocessingCanvas" xmlns:cx="http://schemas.microsoft.com/office/drawing/2014/chartex" xmlns:cx1="http://schemas.microsoft.com/office/drawing/2015/9/8/chartex" xmlns:cx2="http://schemas.microsoft.com/office/drawing/2015/10/21/chartex" xmlns:cx3="http://schemas.microsoft.com/office/drawing/2016/5/9/chartex" xmlns:cx4="http://schemas.microsoft.com/office/drawing/2016/5/10/chartex" xmlns:cx5="http://schemas.microsoft.com/office/drawing/2016/5/11/chartex" xmlns:cx6="http://schemas.microsoft.com/office/drawing/2016/5/12/chartex" xmlns:cx7="http://schemas.microsoft.com/office/drawing/2016/5/13/chartex" xmlns:cx8="http://schemas.microsoft.com/office/drawing/2016/5/14/chartex" xmlns:mc="http://schemas.openxmlformats.org/markup-compatibility/2006" xmlns:aink="http://schemas.microsoft.com/office/drawing/2016/ink" xmlns:am3d="http://schemas.microsoft.com/office/drawing/2017/model3d" xmlns:o="urn:schemas-microsoft-com:office:office" xmlns:oel="http://schemas.microsoft.com/office/2019/extlst" xmlns:r="http://schemas.openxmlformats.org/officeDocument/2006/relationships" xmlns:m="http://schemas.openxmlformats.org/officeDocument/2006/math" xmlns:v="urn:schemas-microsoft-com:vml" xmlns:wp14="http://schemas.microsoft.com/office/word/2010/wordprocessingDrawing" xmlns:wp="http://schemas.openxmlformats.org/drawingml/2006/wordprocessingDrawing" xmlns:w10="urn:schemas-microsoft-com:office:word" xmlns:w="http://schemas.openxmlformats.org/wordprocessingml/2006/main" xmlns:w14="http://schemas.microsoft.com/office/word/2010/wordml" xmlns:w15="http://schemas.microsoft.com/office/word/2012/wordml" xmlns:w16cex="http://schemas.microsoft.com/office/word/2018/wordml/cex" xmlns:w16cid="http://schemas.microsoft.com/office/word/2016/wordml/cid" xmlns:w16="http://schemas.microsoft.com/office/word/2018/wordml" xmlns:w16du="http://schemas.microsoft.com/office/word/2023/wordml/word16du" xmlns:w16sdtdh="http://schemas.microsoft.com/office/word/2020/wordml/sdtdatahash" xmlns:w16sdtfl="http://schemas.microsoft.com/office/word/2024/wordml/sdtformatlock" xmlns:w16se="http://schemas.microsoft.com/office/word/2015/wordml/symex" xmlns:wpg="http://schemas.microsoft.com/office/word/2010/wordprocessingGroup" xmlns:wpi="http://schemas.microsoft.com/office/word/2010/wordprocessingInk" xmlns:wne="http://schemas.microsoft.com/office/word/2006/wordml" xmlns:wps="http://schemas.microsoft.com/office/word/2010/wordprocessingShape" mc:Ignorable="w14 w15 w16se w16cid w16 w16cex w16sdtdh w16sdtfl w16du wp14">
   <w:abstractNum w:abstractNumId="0" w15:restartNumberingAfterBreak="0">
     <w:nsid w:val="00D104A3"/>
     <w:multiLevelType w:val="multilevel"/>
@@ -2471,6 +4502,95 @@
     </w:lvl>
   </w:abstractNum>
   <w:abstractNum w:abstractNumId="4" w15:restartNumberingAfterBreak="0">
+    <w:nsid w:val="1BC7524E"/>
+    <w:multiLevelType w:val="hybridMultilevel"/>
+    <w:tmpl w:val="ED16F3E2"/>
+    <w:lvl w:ilvl="0" w:tplc="1C09000F">
+      <w:start w:val="1"/>
+      <w:numFmt w:val="decimal"/>
+      <w:lvlText w:val="%1."/>
+      <w:lvlJc w:val="left"/>
+      <w:pPr>
+        <w:ind w:left="720" w:hanging="360"/>
+      </w:pPr>
+      <w:rPr>
+        <w:rFonts w:hint="default"/>
+      </w:rPr>
+    </w:lvl>
+    <w:lvl w:ilvl="1" w:tplc="1C090019" w:tentative="1">
+      <w:start w:val="1"/>
+      <w:numFmt w:val="lowerLetter"/>
+      <w:lvlText w:val="%2."/>
+      <w:lvlJc w:val="left"/>
+      <w:pPr>
+        <w:ind w:left="1440" w:hanging="360"/>
+      </w:pPr>
+    </w:lvl>
+    <w:lvl w:ilvl="2" w:tplc="1C09001B" w:tentative="1">
+      <w:start w:val="1"/>
+      <w:numFmt w:val="lowerRoman"/>
+      <w:lvlText w:val="%3."/>
+      <w:lvlJc w:val="right"/>
+      <w:pPr>
+        <w:ind w:left="2160" w:hanging="180"/>
+      </w:pPr>
+    </w:lvl>
+    <w:lvl w:ilvl="3" w:tplc="1C09000F" w:tentative="1">
+      <w:start w:val="1"/>
+      <w:numFmt w:val="decimal"/>
+      <w:lvlText w:val="%4."/>
+      <w:lvlJc w:val="left"/>
+      <w:pPr>
+        <w:ind w:left="2880" w:hanging="360"/>
+      </w:pPr>
+    </w:lvl>
+    <w:lvl w:ilvl="4" w:tplc="1C090019" w:tentative="1">
+      <w:start w:val="1"/>
+      <w:numFmt w:val="lowerLetter"/>
+      <w:lvlText w:val="%5."/>
+      <w:lvlJc w:val="left"/>
+      <w:pPr>
+        <w:ind w:left="3600" w:hanging="360"/>
+      </w:pPr>
+    </w:lvl>
+    <w:lvl w:ilvl="5" w:tplc="1C09001B" w:tentative="1">
+      <w:start w:val="1"/>
+      <w:numFmt w:val="lowerRoman"/>
+      <w:lvlText w:val="%6."/>
+      <w:lvlJc w:val="right"/>
+      <w:pPr>
+        <w:ind w:left="4320" w:hanging="180"/>
+      </w:pPr>
+    </w:lvl>
+    <w:lvl w:ilvl="6" w:tplc="1C09000F" w:tentative="1">
+      <w:start w:val="1"/>
+      <w:numFmt w:val="decimal"/>
+      <w:lvlText w:val="%7."/>
+      <w:lvlJc w:val="left"/>
+      <w:pPr>
+        <w:ind w:left="5040" w:hanging="360"/>
+      </w:pPr>
+    </w:lvl>
+    <w:lvl w:ilvl="7" w:tplc="1C090019" w:tentative="1">
+      <w:start w:val="1"/>
+      <w:numFmt w:val="lowerLetter"/>
+      <w:lvlText w:val="%8."/>
+      <w:lvlJc w:val="left"/>
+      <w:pPr>
+        <w:ind w:left="5760" w:hanging="360"/>
+      </w:pPr>
+    </w:lvl>
+    <w:lvl w:ilvl="8" w:tplc="1C09001B" w:tentative="1">
+      <w:start w:val="1"/>
+      <w:numFmt w:val="lowerRoman"/>
+      <w:lvlText w:val="%9."/>
+      <w:lvlJc w:val="right"/>
+      <w:pPr>
+        <w:ind w:left="6480" w:hanging="180"/>
+      </w:pPr>
+    </w:lvl>
+  </w:abstractNum>
+  <w:abstractNum w:abstractNumId="5" w15:restartNumberingAfterBreak="0">
     <w:nsid w:val="1DDC47B0"/>
     <w:multiLevelType w:val="hybridMultilevel"/>
     <w:tmpl w:val="A4606F58"/>
@@ -2562,7 +4682,7 @@
       </w:pPr>
     </w:lvl>
   </w:abstractNum>
-  <w:abstractNum w:abstractNumId="5" w15:restartNumberingAfterBreak="0">
+  <w:abstractNum w:abstractNumId="6" w15:restartNumberingAfterBreak="0">
     <w:nsid w:val="1E350882"/>
     <w:multiLevelType w:val="hybridMultilevel"/>
     <w:tmpl w:val="1FD0E608"/>
@@ -2675,7 +4795,7 @@
       </w:rPr>
     </w:lvl>
   </w:abstractNum>
-  <w:abstractNum w:abstractNumId="6" w15:restartNumberingAfterBreak="0">
+  <w:abstractNum w:abstractNumId="7" w15:restartNumberingAfterBreak="0">
     <w:nsid w:val="36410B79"/>
     <w:multiLevelType w:val="hybridMultilevel"/>
     <w:tmpl w:val="92FE9D62"/>
@@ -2788,7 +4908,7 @@
       </w:rPr>
     </w:lvl>
   </w:abstractNum>
-  <w:abstractNum w:abstractNumId="7" w15:restartNumberingAfterBreak="0">
+  <w:abstractNum w:abstractNumId="8" w15:restartNumberingAfterBreak="0">
     <w:nsid w:val="3C4B557E"/>
     <w:multiLevelType w:val="hybridMultilevel"/>
     <w:tmpl w:val="0C9AB7D2"/>
@@ -2901,7 +5021,7 @@
       </w:rPr>
     </w:lvl>
   </w:abstractNum>
-  <w:abstractNum w:abstractNumId="8" w15:restartNumberingAfterBreak="0">
+  <w:abstractNum w:abstractNumId="9" w15:restartNumberingAfterBreak="0">
     <w:nsid w:val="3F381945"/>
     <w:multiLevelType w:val="hybridMultilevel"/>
     <w:tmpl w:val="390856FE"/>
@@ -3014,7 +5134,7 @@
       </w:rPr>
     </w:lvl>
   </w:abstractNum>
-  <w:abstractNum w:abstractNumId="9" w15:restartNumberingAfterBreak="0">
+  <w:abstractNum w:abstractNumId="10" w15:restartNumberingAfterBreak="0">
     <w:nsid w:val="432765C9"/>
     <w:multiLevelType w:val="hybridMultilevel"/>
     <w:tmpl w:val="329C1B96"/>
@@ -3100,7 +5220,7 @@
       </w:pPr>
     </w:lvl>
   </w:abstractNum>
-  <w:abstractNum w:abstractNumId="10" w15:restartNumberingAfterBreak="0">
+  <w:abstractNum w:abstractNumId="11" w15:restartNumberingAfterBreak="0">
     <w:nsid w:val="50563DB2"/>
     <w:multiLevelType w:val="hybridMultilevel"/>
     <w:tmpl w:val="1458E4B2"/>
@@ -3213,7 +5333,7 @@
       </w:rPr>
     </w:lvl>
   </w:abstractNum>
-  <w:abstractNum w:abstractNumId="11" w15:restartNumberingAfterBreak="0">
+  <w:abstractNum w:abstractNumId="12" w15:restartNumberingAfterBreak="0">
     <w:nsid w:val="55612865"/>
     <w:multiLevelType w:val="hybridMultilevel"/>
     <w:tmpl w:val="BB50A020"/>
@@ -3326,7 +5446,7 @@
       </w:rPr>
     </w:lvl>
   </w:abstractNum>
-  <w:abstractNum w:abstractNumId="12" w15:restartNumberingAfterBreak="0">
+  <w:abstractNum w:abstractNumId="13" w15:restartNumberingAfterBreak="0">
     <w:nsid w:val="639802ED"/>
     <w:multiLevelType w:val="hybridMultilevel"/>
     <w:tmpl w:val="C8166BF6"/>
@@ -3412,7 +5532,7 @@
       </w:pPr>
     </w:lvl>
   </w:abstractNum>
-  <w:abstractNum w:abstractNumId="13" w15:restartNumberingAfterBreak="0">
+  <w:abstractNum w:abstractNumId="14" w15:restartNumberingAfterBreak="0">
     <w:nsid w:val="6910501A"/>
     <w:multiLevelType w:val="hybridMultilevel"/>
     <w:tmpl w:val="66CE77B4"/>
@@ -3525,7 +5645,7 @@
       </w:rPr>
     </w:lvl>
   </w:abstractNum>
-  <w:abstractNum w:abstractNumId="14" w15:restartNumberingAfterBreak="0">
+  <w:abstractNum w:abstractNumId="15" w15:restartNumberingAfterBreak="0">
     <w:nsid w:val="6A686686"/>
     <w:multiLevelType w:val="hybridMultilevel"/>
     <w:tmpl w:val="EC3C616E"/>
@@ -3642,46 +5762,49 @@
     <w:abstractNumId w:val="0"/>
   </w:num>
   <w:num w:numId="2" w16cid:durableId="2022319321">
-    <w:abstractNumId w:val="11"/>
+    <w:abstractNumId w:val="12"/>
   </w:num>
   <w:num w:numId="3" w16cid:durableId="1911693314">
     <w:abstractNumId w:val="3"/>
   </w:num>
   <w:num w:numId="4" w16cid:durableId="1259489053">
-    <w:abstractNumId w:val="12"/>
+    <w:abstractNumId w:val="13"/>
   </w:num>
   <w:num w:numId="5" w16cid:durableId="325283702">
-    <w:abstractNumId w:val="9"/>
+    <w:abstractNumId w:val="10"/>
   </w:num>
   <w:num w:numId="6" w16cid:durableId="819729018">
     <w:abstractNumId w:val="2"/>
   </w:num>
   <w:num w:numId="7" w16cid:durableId="207106592">
+    <w:abstractNumId w:val="7"/>
+  </w:num>
+  <w:num w:numId="8" w16cid:durableId="492915017">
+    <w:abstractNumId w:val="9"/>
+  </w:num>
+  <w:num w:numId="9" w16cid:durableId="1776747260">
     <w:abstractNumId w:val="6"/>
   </w:num>
-  <w:num w:numId="8" w16cid:durableId="492915017">
+  <w:num w:numId="10" w16cid:durableId="875123364">
+    <w:abstractNumId w:val="5"/>
+  </w:num>
+  <w:num w:numId="11" w16cid:durableId="1404597577">
+    <w:abstractNumId w:val="11"/>
+  </w:num>
+  <w:num w:numId="12" w16cid:durableId="66732681">
     <w:abstractNumId w:val="8"/>
   </w:num>
-  <w:num w:numId="9" w16cid:durableId="1776747260">
-    <w:abstractNumId w:val="5"/>
-  </w:num>
-  <w:num w:numId="10" w16cid:durableId="875123364">
-    <w:abstractNumId w:val="4"/>
-  </w:num>
-  <w:num w:numId="11" w16cid:durableId="1404597577">
-    <w:abstractNumId w:val="10"/>
-  </w:num>
-  <w:num w:numId="12" w16cid:durableId="66732681">
-    <w:abstractNumId w:val="7"/>
-  </w:num>
   <w:num w:numId="13" w16cid:durableId="797378599">
-    <w:abstractNumId w:val="13"/>
+    <w:abstractNumId w:val="14"/>
   </w:num>
   <w:num w:numId="14" w16cid:durableId="851065111">
-    <w:abstractNumId w:val="14"/>
+    <w:abstractNumId w:val="15"/>
   </w:num>
   <w:num w:numId="15" w16cid:durableId="1932931518">
     <w:abstractNumId w:val="1"/>
+  </w:num>
+  <w:num w:numId="16" w16cid:durableId="2126537330">
+    <w:abstractNumId w:val="4"/>
   </w:num>
 </w:numbering>
 </file>
@@ -4612,6 +6735,25 @@
       <w:rFonts w:ascii="Times New Roman" w:hAnsi="Times New Roman" w:cs="Times New Roman"/>
     </w:rPr>
   </w:style>
+  <w:style w:type="table" w:styleId="TableGrid">
+    <w:name w:val="Table Grid"/>
+    <w:basedOn w:val="TableNormal"/>
+    <w:uiPriority w:val="39"/>
+    <w:rsid w:val="00DC1EC3"/>
+    <w:pPr>
+      <w:spacing w:after="0" w:line="240" w:lineRule="auto"/>
+    </w:pPr>
+    <w:tblPr>
+      <w:tblBorders>
+        <w:top w:val="single" w:sz="4" w:space="0" w:color="auto"/>
+        <w:left w:val="single" w:sz="4" w:space="0" w:color="auto"/>
+        <w:bottom w:val="single" w:sz="4" w:space="0" w:color="auto"/>
+        <w:right w:val="single" w:sz="4" w:space="0" w:color="auto"/>
+        <w:insideH w:val="single" w:sz="4" w:space="0" w:color="auto"/>
+        <w:insideV w:val="single" w:sz="4" w:space="0" w:color="auto"/>
+      </w:tblBorders>
+    </w:tblPr>
+  </w:style>
 </w:styles>
 </file>
 

</xml_diff>